<commit_message>
Mostrar en la Tabla S2 la validacion del ponderador contra el de 2023
Agrega la diferencia del ponderador sin calibrar frente al ponderador
publicado por la encuesta y una fila con el promedio de la diferencia
absoluta (0,92 -> 0,48 pp), que hasta ahora solo estaba en un CSV. Asi
la tabla respalda por si sola la frase que se saco del texto principal.
</commit_message>
<xml_diff>
--- a/SUPLEMENTARIO/MATERIAL_SUPLEMENTARIO.docx
+++ b/SUPLEMENTARIO/MATERIAL_SUPLEMENTARIO.docx
@@ -3500,17 +3500,18 @@
         <w:tblLook w:firstRow="1" w:lastRow="0" w:firstColumn="0" w:lastColumn="0" w:noHBand="0" w:noVBand="1"/>
       </w:tblPr>
       <w:tblGrid>
-        <w:gridCol w:w="1367"/>
-        <w:gridCol w:w="927"/>
-        <w:gridCol w:w="840"/>
-        <w:gridCol w:w="894"/>
-        <w:gridCol w:w="1147"/>
-        <w:gridCol w:w="2088"/>
-        <w:gridCol w:w="1207"/>
+        <w:gridCol w:w="1339"/>
+        <w:gridCol w:w="653"/>
+        <w:gridCol w:w="596"/>
+        <w:gridCol w:w="631"/>
+        <w:gridCol w:w="800"/>
+        <w:gridCol w:w="1428"/>
+        <w:gridCol w:w="1009"/>
+        <w:gridCol w:w="947"/>
       </w:tblGrid>
       <w:tr>
         <w:trPr>
-          <w:trHeight w:val="234" w:hRule="auto"/>
+          <w:trHeight w:val="186" w:hRule="auto"/>
           <w:tblHeader/>
         </w:trPr>
         <w:tc>
@@ -3548,20 +3549,20 @@
                 <w:b w:val="false"/>
                 <w:u w:val="none"/>
                 <w:strike w:val="false"/>
-                <w:sz w:val="12"/>
-                <w:szCs w:val="12"/>
-                <w:color w:val="000000"/>
-              </w:rPr>
-            </w:pPr>
-            <w:r>
-              <w:rPr>
-                <w:rFonts w:ascii="Arial" w:hAnsi="Arial" w:eastAsia="Arial" w:cs="Arial"/>
-                <w:i w:val="false"/>
-                <w:b w:val="false"/>
-                <w:u w:val="none"/>
-                <w:strike w:val="false"/>
-                <w:sz w:val="12"/>
-                <w:szCs w:val="12"/>
+                <w:sz w:val="8"/>
+                <w:szCs w:val="8"/>
+                <w:color w:val="000000"/>
+              </w:rPr>
+            </w:pPr>
+            <w:r>
+              <w:rPr>
+                <w:rFonts w:ascii="Arial" w:hAnsi="Arial" w:eastAsia="Arial" w:cs="Arial"/>
+                <w:i w:val="false"/>
+                <w:b w:val="false"/>
+                <w:u w:val="none"/>
+                <w:strike w:val="false"/>
+                <w:sz w:val="8"/>
+                <w:szCs w:val="8"/>
                 <w:color w:val="000000"/>
               </w:rPr>
               <w:t xml:space="preserve">Indicador</w:t>
@@ -3603,20 +3604,20 @@
                 <w:b w:val="false"/>
                 <w:u w:val="none"/>
                 <w:strike w:val="false"/>
-                <w:sz w:val="12"/>
-                <w:szCs w:val="12"/>
-                <w:color w:val="000000"/>
-              </w:rPr>
-            </w:pPr>
-            <w:r>
-              <w:rPr>
-                <w:rFonts w:ascii="Arial" w:hAnsi="Arial" w:eastAsia="Arial" w:cs="Arial"/>
-                <w:i w:val="false"/>
-                <w:b w:val="false"/>
-                <w:u w:val="none"/>
-                <w:strike w:val="false"/>
-                <w:sz w:val="12"/>
-                <w:szCs w:val="12"/>
+                <w:sz w:val="8"/>
+                <w:szCs w:val="8"/>
+                <w:color w:val="000000"/>
+              </w:rPr>
+            </w:pPr>
+            <w:r>
+              <w:rPr>
+                <w:rFonts w:ascii="Arial" w:hAnsi="Arial" w:eastAsia="Arial" w:cs="Arial"/>
+                <w:i w:val="false"/>
+                <w:b w:val="false"/>
+                <w:u w:val="none"/>
+                <w:strike w:val="false"/>
+                <w:sz w:val="8"/>
+                <w:szCs w:val="8"/>
                 <w:color w:val="000000"/>
               </w:rPr>
               <w:t xml:space="preserve">Sin calibrar (%)</w:t>
@@ -3658,20 +3659,20 @@
                 <w:b w:val="false"/>
                 <w:u w:val="none"/>
                 <w:strike w:val="false"/>
-                <w:sz w:val="12"/>
-                <w:szCs w:val="12"/>
-                <w:color w:val="000000"/>
-              </w:rPr>
-            </w:pPr>
-            <w:r>
-              <w:rPr>
-                <w:rFonts w:ascii="Arial" w:hAnsi="Arial" w:eastAsia="Arial" w:cs="Arial"/>
-                <w:i w:val="false"/>
-                <w:b w:val="false"/>
-                <w:u w:val="none"/>
-                <w:strike w:val="false"/>
-                <w:sz w:val="12"/>
-                <w:szCs w:val="12"/>
+                <w:sz w:val="8"/>
+                <w:szCs w:val="8"/>
+                <w:color w:val="000000"/>
+              </w:rPr>
+            </w:pPr>
+            <w:r>
+              <w:rPr>
+                <w:rFonts w:ascii="Arial" w:hAnsi="Arial" w:eastAsia="Arial" w:cs="Arial"/>
+                <w:i w:val="false"/>
+                <w:b w:val="false"/>
+                <w:u w:val="none"/>
+                <w:strike w:val="false"/>
+                <w:sz w:val="8"/>
+                <w:szCs w:val="8"/>
                 <w:color w:val="000000"/>
               </w:rPr>
               <w:t xml:space="preserve">Calibrado (%)</w:t>
@@ -3713,20 +3714,20 @@
                 <w:b w:val="false"/>
                 <w:u w:val="none"/>
                 <w:strike w:val="false"/>
-                <w:sz w:val="12"/>
-                <w:szCs w:val="12"/>
-                <w:color w:val="000000"/>
-              </w:rPr>
-            </w:pPr>
-            <w:r>
-              <w:rPr>
-                <w:rFonts w:ascii="Arial" w:hAnsi="Arial" w:eastAsia="Arial" w:cs="Arial"/>
-                <w:i w:val="false"/>
-                <w:b w:val="false"/>
-                <w:u w:val="none"/>
-                <w:strike w:val="false"/>
-                <w:sz w:val="12"/>
-                <w:szCs w:val="12"/>
+                <w:sz w:val="8"/>
+                <w:szCs w:val="8"/>
+                <w:color w:val="000000"/>
+              </w:rPr>
+            </w:pPr>
+            <w:r>
+              <w:rPr>
+                <w:rFonts w:ascii="Arial" w:hAnsi="Arial" w:eastAsia="Arial" w:cs="Arial"/>
+                <w:i w:val="false"/>
+                <w:b w:val="false"/>
+                <w:u w:val="none"/>
+                <w:strike w:val="false"/>
+                <w:sz w:val="8"/>
+                <w:szCs w:val="8"/>
                 <w:color w:val="000000"/>
               </w:rPr>
               <w:t xml:space="preserve">Diferencia (pp)</w:t>
@@ -3768,20 +3769,20 @@
                 <w:b w:val="false"/>
                 <w:u w:val="none"/>
                 <w:strike w:val="false"/>
-                <w:sz w:val="12"/>
-                <w:szCs w:val="12"/>
-                <w:color w:val="000000"/>
-              </w:rPr>
-            </w:pPr>
-            <w:r>
-              <w:rPr>
-                <w:rFonts w:ascii="Arial" w:hAnsi="Arial" w:eastAsia="Arial" w:cs="Arial"/>
-                <w:i w:val="false"/>
-                <w:b w:val="false"/>
-                <w:u w:val="none"/>
-                <w:strike w:val="false"/>
-                <w:sz w:val="12"/>
-                <w:szCs w:val="12"/>
+                <w:sz w:val="8"/>
+                <w:szCs w:val="8"/>
+                <w:color w:val="000000"/>
+              </w:rPr>
+            </w:pPr>
+            <w:r>
+              <w:rPr>
+                <w:rFonts w:ascii="Arial" w:hAnsi="Arial" w:eastAsia="Arial" w:cs="Arial"/>
+                <w:i w:val="false"/>
+                <w:b w:val="false"/>
+                <w:u w:val="none"/>
+                <w:strike w:val="false"/>
+                <w:sz w:val="8"/>
+                <w:szCs w:val="8"/>
                 <w:color w:val="000000"/>
               </w:rPr>
               <w:t xml:space="preserve">2023: calibrado (%)</w:t>
@@ -3823,20 +3824,20 @@
                 <w:b w:val="false"/>
                 <w:u w:val="none"/>
                 <w:strike w:val="false"/>
-                <w:sz w:val="12"/>
-                <w:szCs w:val="12"/>
-                <w:color w:val="000000"/>
-              </w:rPr>
-            </w:pPr>
-            <w:r>
-              <w:rPr>
-                <w:rFonts w:ascii="Arial" w:hAnsi="Arial" w:eastAsia="Arial" w:cs="Arial"/>
-                <w:i w:val="false"/>
-                <w:b w:val="false"/>
-                <w:u w:val="none"/>
-                <w:strike w:val="false"/>
-                <w:sz w:val="12"/>
-                <w:szCs w:val="12"/>
+                <w:sz w:val="8"/>
+                <w:szCs w:val="8"/>
+                <w:color w:val="000000"/>
+              </w:rPr>
+            </w:pPr>
+            <w:r>
+              <w:rPr>
+                <w:rFonts w:ascii="Arial" w:hAnsi="Arial" w:eastAsia="Arial" w:cs="Arial"/>
+                <w:i w:val="false"/>
+                <w:b w:val="false"/>
+                <w:u w:val="none"/>
+                <w:strike w:val="false"/>
+                <w:sz w:val="8"/>
+                <w:szCs w:val="8"/>
                 <w:color w:val="000000"/>
               </w:rPr>
               <w:t xml:space="preserve">2023: ponderador de la encuesta (%)</w:t>
@@ -3878,30 +3879,85 @@
                 <w:b w:val="false"/>
                 <w:u w:val="none"/>
                 <w:strike w:val="false"/>
-                <w:sz w:val="12"/>
-                <w:szCs w:val="12"/>
-                <w:color w:val="000000"/>
-              </w:rPr>
-            </w:pPr>
-            <w:r>
-              <w:rPr>
-                <w:rFonts w:ascii="Arial" w:hAnsi="Arial" w:eastAsia="Arial" w:cs="Arial"/>
-                <w:i w:val="false"/>
-                <w:b w:val="false"/>
-                <w:u w:val="none"/>
-                <w:strike w:val="false"/>
-                <w:sz w:val="12"/>
-                <w:szCs w:val="12"/>
-                <w:color w:val="000000"/>
-              </w:rPr>
-              <w:t xml:space="preserve">2023: diferencia (pp)</w:t>
+                <w:sz w:val="8"/>
+                <w:szCs w:val="8"/>
+                <w:color w:val="000000"/>
+              </w:rPr>
+            </w:pPr>
+            <w:r>
+              <w:rPr>
+                <w:rFonts w:ascii="Arial" w:hAnsi="Arial" w:eastAsia="Arial" w:cs="Arial"/>
+                <w:i w:val="false"/>
+                <w:b w:val="false"/>
+                <w:u w:val="none"/>
+                <w:strike w:val="false"/>
+                <w:sz w:val="8"/>
+                <w:szCs w:val="8"/>
+                <w:color w:val="000000"/>
+              </w:rPr>
+              <w:t xml:space="preserve">2023: dif. sin calibrar (pp)</w:t>
+            </w:r>
+          </w:p>
+        </w:tc>
+        <w:tc>
+          <w:tcPr>
+            <w:tcBorders>
+              <w:bottom w:val="single" w:sz="8" w:space="0" w:color="000000"/>
+              <w:top w:val="none" w:sz="0" w:space="0" w:color="000000"/>
+              <w:left w:val="none" w:sz="0" w:space="0" w:color="000000"/>
+              <w:right w:val="none" w:sz="0" w:space="0" w:color="000000"/>
+            </w:tcBorders>
+            <w:shd w:val="clear" w:color="auto" w:fill="FFFFFF"/>
+            <w:tcMar>
+              <w:top w:w="0" w:type="dxa"/>
+              <w:bottom w:w="0" w:type="dxa"/>
+              <w:left w:w="0" w:type="dxa"/>
+              <w:right w:w="0" w:type="dxa"/>
+            </w:tcMar>
+            <w:vAlign w:val="center"/>
+          </w:tcPr>
+          <w:p>
+            <w:pPr>
+              <w:pStyle w:val="Normal"/>
+              <w:jc w:val="center"/>
+              <w:pBdr>
+                <w:bottom w:val="none" w:sz="0" w:space="0" w:color="000000"/>
+                <w:top w:val="none" w:sz="0" w:space="0" w:color="000000"/>
+                <w:left w:val="none" w:sz="0" w:space="0" w:color="000000"/>
+                <w:right w:val="none" w:sz="0" w:space="0" w:color="000000"/>
+              </w:pBdr>
+              <w:spacing w:after="40" w:before="40" w:line="240"/>
+              <w:ind w:left="40" w:right="40" w:firstLine="0" w:firstLineChars="0"/>
+              <w:rPr>
+                <w:rFonts w:ascii="Arial" w:hAnsi="Arial" w:eastAsia="Arial" w:cs="Arial"/>
+                <w:i w:val="false"/>
+                <w:b w:val="false"/>
+                <w:u w:val="none"/>
+                <w:strike w:val="false"/>
+                <w:sz w:val="8"/>
+                <w:szCs w:val="8"/>
+                <w:color w:val="000000"/>
+              </w:rPr>
+            </w:pPr>
+            <w:r>
+              <w:rPr>
+                <w:rFonts w:ascii="Arial" w:hAnsi="Arial" w:eastAsia="Arial" w:cs="Arial"/>
+                <w:i w:val="false"/>
+                <w:b w:val="false"/>
+                <w:u w:val="none"/>
+                <w:strike w:val="false"/>
+                <w:sz w:val="8"/>
+                <w:szCs w:val="8"/>
+                <w:color w:val="000000"/>
+              </w:rPr>
+              <w:t xml:space="preserve">2023: dif. calibrado (pp)</w:t>
             </w:r>
           </w:p>
         </w:tc>
       </w:tr>
       <w:tr>
         <w:trPr>
-          <w:trHeight w:val="224" w:hRule="auto"/>
+          <w:trHeight w:val="176" w:hRule="auto"/>
         </w:trPr>
         <w:tc>
           <w:tcPr>
@@ -3938,20 +3994,20 @@
                 <w:b w:val="false"/>
                 <w:u w:val="none"/>
                 <w:strike w:val="false"/>
-                <w:sz w:val="12"/>
-                <w:szCs w:val="12"/>
-                <w:color w:val="000000"/>
-              </w:rPr>
-            </w:pPr>
-            <w:r>
-              <w:rPr>
-                <w:rFonts w:ascii="Arial" w:hAnsi="Arial" w:eastAsia="Arial" w:cs="Arial"/>
-                <w:i w:val="false"/>
-                <w:b w:val="false"/>
-                <w:u w:val="none"/>
-                <w:strike w:val="false"/>
-                <w:sz w:val="12"/>
-                <w:szCs w:val="12"/>
+                <w:sz w:val="8"/>
+                <w:szCs w:val="8"/>
+                <w:color w:val="000000"/>
+              </w:rPr>
+            </w:pPr>
+            <w:r>
+              <w:rPr>
+                <w:rFonts w:ascii="Arial" w:hAnsi="Arial" w:eastAsia="Arial" w:cs="Arial"/>
+                <w:i w:val="false"/>
+                <w:b w:val="false"/>
+                <w:u w:val="none"/>
+                <w:strike w:val="false"/>
+                <w:sz w:val="8"/>
+                <w:szCs w:val="8"/>
                 <w:color w:val="000000"/>
               </w:rPr>
               <w:t xml:space="preserve">Prevalencia HTA (ESH)</w:t>
@@ -3993,20 +4049,20 @@
                 <w:b w:val="false"/>
                 <w:u w:val="none"/>
                 <w:strike w:val="false"/>
-                <w:sz w:val="12"/>
-                <w:szCs w:val="12"/>
-                <w:color w:val="000000"/>
-              </w:rPr>
-            </w:pPr>
-            <w:r>
-              <w:rPr>
-                <w:rFonts w:ascii="Arial" w:hAnsi="Arial" w:eastAsia="Arial" w:cs="Arial"/>
-                <w:i w:val="false"/>
-                <w:b w:val="false"/>
-                <w:u w:val="none"/>
-                <w:strike w:val="false"/>
-                <w:sz w:val="12"/>
-                <w:szCs w:val="12"/>
+                <w:sz w:val="8"/>
+                <w:szCs w:val="8"/>
+                <w:color w:val="000000"/>
+              </w:rPr>
+            </w:pPr>
+            <w:r>
+              <w:rPr>
+                <w:rFonts w:ascii="Arial" w:hAnsi="Arial" w:eastAsia="Arial" w:cs="Arial"/>
+                <w:i w:val="false"/>
+                <w:b w:val="false"/>
+                <w:u w:val="none"/>
+                <w:strike w:val="false"/>
+                <w:sz w:val="8"/>
+                <w:szCs w:val="8"/>
                 <w:color w:val="000000"/>
               </w:rPr>
               <w:t xml:space="preserve">28,4</w:t>
@@ -4048,20 +4104,20 @@
                 <w:b w:val="false"/>
                 <w:u w:val="none"/>
                 <w:strike w:val="false"/>
-                <w:sz w:val="12"/>
-                <w:szCs w:val="12"/>
-                <w:color w:val="000000"/>
-              </w:rPr>
-            </w:pPr>
-            <w:r>
-              <w:rPr>
-                <w:rFonts w:ascii="Arial" w:hAnsi="Arial" w:eastAsia="Arial" w:cs="Arial"/>
-                <w:i w:val="false"/>
-                <w:b w:val="false"/>
-                <w:u w:val="none"/>
-                <w:strike w:val="false"/>
-                <w:sz w:val="12"/>
-                <w:szCs w:val="12"/>
+                <w:sz w:val="8"/>
+                <w:szCs w:val="8"/>
+                <w:color w:val="000000"/>
+              </w:rPr>
+            </w:pPr>
+            <w:r>
+              <w:rPr>
+                <w:rFonts w:ascii="Arial" w:hAnsi="Arial" w:eastAsia="Arial" w:cs="Arial"/>
+                <w:i w:val="false"/>
+                <w:b w:val="false"/>
+                <w:u w:val="none"/>
+                <w:strike w:val="false"/>
+                <w:sz w:val="8"/>
+                <w:szCs w:val="8"/>
                 <w:color w:val="000000"/>
               </w:rPr>
               <w:t xml:space="preserve">27,3</w:t>
@@ -4103,20 +4159,20 @@
                 <w:b w:val="false"/>
                 <w:u w:val="none"/>
                 <w:strike w:val="false"/>
-                <w:sz w:val="12"/>
-                <w:szCs w:val="12"/>
-                <w:color w:val="000000"/>
-              </w:rPr>
-            </w:pPr>
-            <w:r>
-              <w:rPr>
-                <w:rFonts w:ascii="Arial" w:hAnsi="Arial" w:eastAsia="Arial" w:cs="Arial"/>
-                <w:i w:val="false"/>
-                <w:b w:val="false"/>
-                <w:u w:val="none"/>
-                <w:strike w:val="false"/>
-                <w:sz w:val="12"/>
-                <w:szCs w:val="12"/>
+                <w:sz w:val="8"/>
+                <w:szCs w:val="8"/>
+                <w:color w:val="000000"/>
+              </w:rPr>
+            </w:pPr>
+            <w:r>
+              <w:rPr>
+                <w:rFonts w:ascii="Arial" w:hAnsi="Arial" w:eastAsia="Arial" w:cs="Arial"/>
+                <w:i w:val="false"/>
+                <w:b w:val="false"/>
+                <w:u w:val="none"/>
+                <w:strike w:val="false"/>
+                <w:sz w:val="8"/>
+                <w:szCs w:val="8"/>
                 <w:color w:val="000000"/>
               </w:rPr>
               <w:t xml:space="preserve">-1,11</w:t>
@@ -4158,20 +4214,20 @@
                 <w:b w:val="false"/>
                 <w:u w:val="none"/>
                 <w:strike w:val="false"/>
-                <w:sz w:val="12"/>
-                <w:szCs w:val="12"/>
-                <w:color w:val="000000"/>
-              </w:rPr>
-            </w:pPr>
-            <w:r>
-              <w:rPr>
-                <w:rFonts w:ascii="Arial" w:hAnsi="Arial" w:eastAsia="Arial" w:cs="Arial"/>
-                <w:i w:val="false"/>
-                <w:b w:val="false"/>
-                <w:u w:val="none"/>
-                <w:strike w:val="false"/>
-                <w:sz w:val="12"/>
-                <w:szCs w:val="12"/>
+                <w:sz w:val="8"/>
+                <w:szCs w:val="8"/>
+                <w:color w:val="000000"/>
+              </w:rPr>
+            </w:pPr>
+            <w:r>
+              <w:rPr>
+                <w:rFonts w:ascii="Arial" w:hAnsi="Arial" w:eastAsia="Arial" w:cs="Arial"/>
+                <w:i w:val="false"/>
+                <w:b w:val="false"/>
+                <w:u w:val="none"/>
+                <w:strike w:val="false"/>
+                <w:sz w:val="8"/>
+                <w:szCs w:val="8"/>
                 <w:color w:val="000000"/>
               </w:rPr>
               <w:t xml:space="preserve">29,9</w:t>
@@ -4213,20 +4269,20 @@
                 <w:b w:val="false"/>
                 <w:u w:val="none"/>
                 <w:strike w:val="false"/>
-                <w:sz w:val="12"/>
-                <w:szCs w:val="12"/>
-                <w:color w:val="000000"/>
-              </w:rPr>
-            </w:pPr>
-            <w:r>
-              <w:rPr>
-                <w:rFonts w:ascii="Arial" w:hAnsi="Arial" w:eastAsia="Arial" w:cs="Arial"/>
-                <w:i w:val="false"/>
-                <w:b w:val="false"/>
-                <w:u w:val="none"/>
-                <w:strike w:val="false"/>
-                <w:sz w:val="12"/>
-                <w:szCs w:val="12"/>
+                <w:sz w:val="8"/>
+                <w:szCs w:val="8"/>
+                <w:color w:val="000000"/>
+              </w:rPr>
+            </w:pPr>
+            <w:r>
+              <w:rPr>
+                <w:rFonts w:ascii="Arial" w:hAnsi="Arial" w:eastAsia="Arial" w:cs="Arial"/>
+                <w:i w:val="false"/>
+                <w:b w:val="false"/>
+                <w:u w:val="none"/>
+                <w:strike w:val="false"/>
+                <w:sz w:val="8"/>
+                <w:szCs w:val="8"/>
                 <w:color w:val="000000"/>
               </w:rPr>
               <w:t xml:space="preserve">30,2</w:t>
@@ -4268,20 +4324,75 @@
                 <w:b w:val="false"/>
                 <w:u w:val="none"/>
                 <w:strike w:val="false"/>
-                <w:sz w:val="12"/>
-                <w:szCs w:val="12"/>
-                <w:color w:val="000000"/>
-              </w:rPr>
-            </w:pPr>
-            <w:r>
-              <w:rPr>
-                <w:rFonts w:ascii="Arial" w:hAnsi="Arial" w:eastAsia="Arial" w:cs="Arial"/>
-                <w:i w:val="false"/>
-                <w:b w:val="false"/>
-                <w:u w:val="none"/>
-                <w:strike w:val="false"/>
-                <w:sz w:val="12"/>
-                <w:szCs w:val="12"/>
+                <w:sz w:val="8"/>
+                <w:szCs w:val="8"/>
+                <w:color w:val="000000"/>
+              </w:rPr>
+            </w:pPr>
+            <w:r>
+              <w:rPr>
+                <w:rFonts w:ascii="Arial" w:hAnsi="Arial" w:eastAsia="Arial" w:cs="Arial"/>
+                <w:i w:val="false"/>
+                <w:b w:val="false"/>
+                <w:u w:val="none"/>
+                <w:strike w:val="false"/>
+                <w:sz w:val="8"/>
+                <w:szCs w:val="8"/>
+                <w:color w:val="000000"/>
+              </w:rPr>
+              <w:t xml:space="preserve">0,62</w:t>
+            </w:r>
+          </w:p>
+        </w:tc>
+        <w:tc>
+          <w:tcPr>
+            <w:tcBorders>
+              <w:bottom w:val="none" w:sz="0" w:space="0" w:color="000000"/>
+              <w:top w:val="single" w:sz="8" w:space="0" w:color="000000"/>
+              <w:left w:val="none" w:sz="0" w:space="0" w:color="000000"/>
+              <w:right w:val="none" w:sz="0" w:space="0" w:color="000000"/>
+            </w:tcBorders>
+            <w:shd w:val="clear" w:color="auto" w:fill="FFFFFF"/>
+            <w:tcMar>
+              <w:top w:w="0" w:type="dxa"/>
+              <w:bottom w:w="0" w:type="dxa"/>
+              <w:left w:w="0" w:type="dxa"/>
+              <w:right w:w="0" w:type="dxa"/>
+            </w:tcMar>
+            <w:vAlign w:val="center"/>
+          </w:tcPr>
+          <w:p>
+            <w:pPr>
+              <w:pStyle w:val="Normal"/>
+              <w:jc w:val="center"/>
+              <w:pBdr>
+                <w:bottom w:val="none" w:sz="0" w:space="0" w:color="000000"/>
+                <w:top w:val="none" w:sz="0" w:space="0" w:color="000000"/>
+                <w:left w:val="none" w:sz="0" w:space="0" w:color="000000"/>
+                <w:right w:val="none" w:sz="0" w:space="0" w:color="000000"/>
+              </w:pBdr>
+              <w:spacing w:after="40" w:before="40" w:line="240"/>
+              <w:ind w:left="40" w:right="40" w:firstLine="0" w:firstLineChars="0"/>
+              <w:rPr>
+                <w:rFonts w:ascii="Arial" w:hAnsi="Arial" w:eastAsia="Arial" w:cs="Arial"/>
+                <w:i w:val="false"/>
+                <w:b w:val="false"/>
+                <w:u w:val="none"/>
+                <w:strike w:val="false"/>
+                <w:sz w:val="8"/>
+                <w:szCs w:val="8"/>
+                <w:color w:val="000000"/>
+              </w:rPr>
+            </w:pPr>
+            <w:r>
+              <w:rPr>
+                <w:rFonts w:ascii="Arial" w:hAnsi="Arial" w:eastAsia="Arial" w:cs="Arial"/>
+                <w:i w:val="false"/>
+                <w:b w:val="false"/>
+                <w:u w:val="none"/>
+                <w:strike w:val="false"/>
+                <w:sz w:val="8"/>
+                <w:szCs w:val="8"/>
                 <w:color w:val="000000"/>
               </w:rPr>
               <w:t xml:space="preserve">-0,29</w:t>
@@ -4291,7 +4402,7 @@
       </w:tr>
       <w:tr>
         <w:trPr>
-          <w:trHeight w:val="224" w:hRule="auto"/>
+          <w:trHeight w:val="176" w:hRule="auto"/>
         </w:trPr>
         <w:tc>
           <w:tcPr>
@@ -4328,20 +4439,20 @@
                 <w:b w:val="false"/>
                 <w:u w:val="none"/>
                 <w:strike w:val="false"/>
-                <w:sz w:val="12"/>
-                <w:szCs w:val="12"/>
-                <w:color w:val="000000"/>
-              </w:rPr>
-            </w:pPr>
-            <w:r>
-              <w:rPr>
-                <w:rFonts w:ascii="Arial" w:hAnsi="Arial" w:eastAsia="Arial" w:cs="Arial"/>
-                <w:i w:val="false"/>
-                <w:b w:val="false"/>
-                <w:u w:val="none"/>
-                <w:strike w:val="false"/>
-                <w:sz w:val="12"/>
-                <w:szCs w:val="12"/>
+                <w:sz w:val="8"/>
+                <w:szCs w:val="8"/>
+                <w:color w:val="000000"/>
+              </w:rPr>
+            </w:pPr>
+            <w:r>
+              <w:rPr>
+                <w:rFonts w:ascii="Arial" w:hAnsi="Arial" w:eastAsia="Arial" w:cs="Arial"/>
+                <w:i w:val="false"/>
+                <w:b w:val="false"/>
+                <w:u w:val="none"/>
+                <w:strike w:val="false"/>
+                <w:sz w:val="8"/>
+                <w:szCs w:val="8"/>
                 <w:color w:val="000000"/>
               </w:rPr>
               <w:t xml:space="preserve">Diagnóstico (ESH)</w:t>
@@ -4383,20 +4494,20 @@
                 <w:b w:val="false"/>
                 <w:u w:val="none"/>
                 <w:strike w:val="false"/>
-                <w:sz w:val="12"/>
-                <w:szCs w:val="12"/>
-                <w:color w:val="000000"/>
-              </w:rPr>
-            </w:pPr>
-            <w:r>
-              <w:rPr>
-                <w:rFonts w:ascii="Arial" w:hAnsi="Arial" w:eastAsia="Arial" w:cs="Arial"/>
-                <w:i w:val="false"/>
-                <w:b w:val="false"/>
-                <w:u w:val="none"/>
-                <w:strike w:val="false"/>
-                <w:sz w:val="12"/>
-                <w:szCs w:val="12"/>
+                <w:sz w:val="8"/>
+                <w:szCs w:val="8"/>
+                <w:color w:val="000000"/>
+              </w:rPr>
+            </w:pPr>
+            <w:r>
+              <w:rPr>
+                <w:rFonts w:ascii="Arial" w:hAnsi="Arial" w:eastAsia="Arial" w:cs="Arial"/>
+                <w:i w:val="false"/>
+                <w:b w:val="false"/>
+                <w:u w:val="none"/>
+                <w:strike w:val="false"/>
+                <w:sz w:val="8"/>
+                <w:szCs w:val="8"/>
                 <w:color w:val="000000"/>
               </w:rPr>
               <w:t xml:space="preserve">65,7</w:t>
@@ -4438,20 +4549,20 @@
                 <w:b w:val="false"/>
                 <w:u w:val="none"/>
                 <w:strike w:val="false"/>
-                <w:sz w:val="12"/>
-                <w:szCs w:val="12"/>
-                <w:color w:val="000000"/>
-              </w:rPr>
-            </w:pPr>
-            <w:r>
-              <w:rPr>
-                <w:rFonts w:ascii="Arial" w:hAnsi="Arial" w:eastAsia="Arial" w:cs="Arial"/>
-                <w:i w:val="false"/>
-                <w:b w:val="false"/>
-                <w:u w:val="none"/>
-                <w:strike w:val="false"/>
-                <w:sz w:val="12"/>
-                <w:szCs w:val="12"/>
+                <w:sz w:val="8"/>
+                <w:szCs w:val="8"/>
+                <w:color w:val="000000"/>
+              </w:rPr>
+            </w:pPr>
+            <w:r>
+              <w:rPr>
+                <w:rFonts w:ascii="Arial" w:hAnsi="Arial" w:eastAsia="Arial" w:cs="Arial"/>
+                <w:i w:val="false"/>
+                <w:b w:val="false"/>
+                <w:u w:val="none"/>
+                <w:strike w:val="false"/>
+                <w:sz w:val="8"/>
+                <w:szCs w:val="8"/>
                 <w:color w:val="000000"/>
               </w:rPr>
               <w:t xml:space="preserve">65,9</w:t>
@@ -4493,20 +4604,20 @@
                 <w:b w:val="false"/>
                 <w:u w:val="none"/>
                 <w:strike w:val="false"/>
-                <w:sz w:val="12"/>
-                <w:szCs w:val="12"/>
-                <w:color w:val="000000"/>
-              </w:rPr>
-            </w:pPr>
-            <w:r>
-              <w:rPr>
-                <w:rFonts w:ascii="Arial" w:hAnsi="Arial" w:eastAsia="Arial" w:cs="Arial"/>
-                <w:i w:val="false"/>
-                <w:b w:val="false"/>
-                <w:u w:val="none"/>
-                <w:strike w:val="false"/>
-                <w:sz w:val="12"/>
-                <w:szCs w:val="12"/>
+                <w:sz w:val="8"/>
+                <w:szCs w:val="8"/>
+                <w:color w:val="000000"/>
+              </w:rPr>
+            </w:pPr>
+            <w:r>
+              <w:rPr>
+                <w:rFonts w:ascii="Arial" w:hAnsi="Arial" w:eastAsia="Arial" w:cs="Arial"/>
+                <w:i w:val="false"/>
+                <w:b w:val="false"/>
+                <w:u w:val="none"/>
+                <w:strike w:val="false"/>
+                <w:sz w:val="8"/>
+                <w:szCs w:val="8"/>
                 <w:color w:val="000000"/>
               </w:rPr>
               <w:t xml:space="preserve">0,24</w:t>
@@ -4548,20 +4659,20 @@
                 <w:b w:val="false"/>
                 <w:u w:val="none"/>
                 <w:strike w:val="false"/>
-                <w:sz w:val="12"/>
-                <w:szCs w:val="12"/>
-                <w:color w:val="000000"/>
-              </w:rPr>
-            </w:pPr>
-            <w:r>
-              <w:rPr>
-                <w:rFonts w:ascii="Arial" w:hAnsi="Arial" w:eastAsia="Arial" w:cs="Arial"/>
-                <w:i w:val="false"/>
-                <w:b w:val="false"/>
-                <w:u w:val="none"/>
-                <w:strike w:val="false"/>
-                <w:sz w:val="12"/>
-                <w:szCs w:val="12"/>
+                <w:sz w:val="8"/>
+                <w:szCs w:val="8"/>
+                <w:color w:val="000000"/>
+              </w:rPr>
+            </w:pPr>
+            <w:r>
+              <w:rPr>
+                <w:rFonts w:ascii="Arial" w:hAnsi="Arial" w:eastAsia="Arial" w:cs="Arial"/>
+                <w:i w:val="false"/>
+                <w:b w:val="false"/>
+                <w:u w:val="none"/>
+                <w:strike w:val="false"/>
+                <w:sz w:val="8"/>
+                <w:szCs w:val="8"/>
                 <w:color w:val="000000"/>
               </w:rPr>
               <w:t xml:space="preserve">64,9</w:t>
@@ -4603,20 +4714,20 @@
                 <w:b w:val="false"/>
                 <w:u w:val="none"/>
                 <w:strike w:val="false"/>
-                <w:sz w:val="12"/>
-                <w:szCs w:val="12"/>
-                <w:color w:val="000000"/>
-              </w:rPr>
-            </w:pPr>
-            <w:r>
-              <w:rPr>
-                <w:rFonts w:ascii="Arial" w:hAnsi="Arial" w:eastAsia="Arial" w:cs="Arial"/>
-                <w:i w:val="false"/>
-                <w:b w:val="false"/>
-                <w:u w:val="none"/>
-                <w:strike w:val="false"/>
-                <w:sz w:val="12"/>
-                <w:szCs w:val="12"/>
+                <w:sz w:val="8"/>
+                <w:szCs w:val="8"/>
+                <w:color w:val="000000"/>
+              </w:rPr>
+            </w:pPr>
+            <w:r>
+              <w:rPr>
+                <w:rFonts w:ascii="Arial" w:hAnsi="Arial" w:eastAsia="Arial" w:cs="Arial"/>
+                <w:i w:val="false"/>
+                <w:b w:val="false"/>
+                <w:u w:val="none"/>
+                <w:strike w:val="false"/>
+                <w:sz w:val="8"/>
+                <w:szCs w:val="8"/>
                 <w:color w:val="000000"/>
               </w:rPr>
               <w:t xml:space="preserve">64,6</w:t>
@@ -4658,20 +4769,75 @@
                 <w:b w:val="false"/>
                 <w:u w:val="none"/>
                 <w:strike w:val="false"/>
-                <w:sz w:val="12"/>
-                <w:szCs w:val="12"/>
-                <w:color w:val="000000"/>
-              </w:rPr>
-            </w:pPr>
-            <w:r>
-              <w:rPr>
-                <w:rFonts w:ascii="Arial" w:hAnsi="Arial" w:eastAsia="Arial" w:cs="Arial"/>
-                <w:i w:val="false"/>
-                <w:b w:val="false"/>
-                <w:u w:val="none"/>
-                <w:strike w:val="false"/>
-                <w:sz w:val="12"/>
-                <w:szCs w:val="12"/>
+                <w:sz w:val="8"/>
+                <w:szCs w:val="8"/>
+                <w:color w:val="000000"/>
+              </w:rPr>
+            </w:pPr>
+            <w:r>
+              <w:rPr>
+                <w:rFonts w:ascii="Arial" w:hAnsi="Arial" w:eastAsia="Arial" w:cs="Arial"/>
+                <w:i w:val="false"/>
+                <w:b w:val="false"/>
+                <w:u w:val="none"/>
+                <w:strike w:val="false"/>
+                <w:sz w:val="8"/>
+                <w:szCs w:val="8"/>
+                <w:color w:val="000000"/>
+              </w:rPr>
+              <w:t xml:space="preserve">1,03</w:t>
+            </w:r>
+          </w:p>
+        </w:tc>
+        <w:tc>
+          <w:tcPr>
+            <w:tcBorders>
+              <w:bottom w:val="none" w:sz="0" w:space="0" w:color="000000"/>
+              <w:top w:val="none" w:sz="0" w:space="0" w:color="000000"/>
+              <w:left w:val="none" w:sz="0" w:space="0" w:color="000000"/>
+              <w:right w:val="none" w:sz="0" w:space="0" w:color="000000"/>
+            </w:tcBorders>
+            <w:shd w:val="clear" w:color="auto" w:fill="FFFFFF"/>
+            <w:tcMar>
+              <w:top w:w="0" w:type="dxa"/>
+              <w:bottom w:w="0" w:type="dxa"/>
+              <w:left w:w="0" w:type="dxa"/>
+              <w:right w:w="0" w:type="dxa"/>
+            </w:tcMar>
+            <w:vAlign w:val="center"/>
+          </w:tcPr>
+          <w:p>
+            <w:pPr>
+              <w:pStyle w:val="Normal"/>
+              <w:jc w:val="center"/>
+              <w:pBdr>
+                <w:bottom w:val="none" w:sz="0" w:space="0" w:color="000000"/>
+                <w:top w:val="none" w:sz="0" w:space="0" w:color="000000"/>
+                <w:left w:val="none" w:sz="0" w:space="0" w:color="000000"/>
+                <w:right w:val="none" w:sz="0" w:space="0" w:color="000000"/>
+              </w:pBdr>
+              <w:spacing w:after="40" w:before="40" w:line="240"/>
+              <w:ind w:left="40" w:right="40" w:firstLine="0" w:firstLineChars="0"/>
+              <w:rPr>
+                <w:rFonts w:ascii="Arial" w:hAnsi="Arial" w:eastAsia="Arial" w:cs="Arial"/>
+                <w:i w:val="false"/>
+                <w:b w:val="false"/>
+                <w:u w:val="none"/>
+                <w:strike w:val="false"/>
+                <w:sz w:val="8"/>
+                <w:szCs w:val="8"/>
+                <w:color w:val="000000"/>
+              </w:rPr>
+            </w:pPr>
+            <w:r>
+              <w:rPr>
+                <w:rFonts w:ascii="Arial" w:hAnsi="Arial" w:eastAsia="Arial" w:cs="Arial"/>
+                <w:i w:val="false"/>
+                <w:b w:val="false"/>
+                <w:u w:val="none"/>
+                <w:strike w:val="false"/>
+                <w:sz w:val="8"/>
+                <w:szCs w:val="8"/>
                 <w:color w:val="000000"/>
               </w:rPr>
               <w:t xml:space="preserve">0,38</w:t>
@@ -4681,7 +4847,7 @@
       </w:tr>
       <w:tr>
         <w:trPr>
-          <w:trHeight w:val="224" w:hRule="auto"/>
+          <w:trHeight w:val="176" w:hRule="auto"/>
         </w:trPr>
         <w:tc>
           <w:tcPr>
@@ -4718,20 +4884,20 @@
                 <w:b w:val="false"/>
                 <w:u w:val="none"/>
                 <w:strike w:val="false"/>
-                <w:sz w:val="12"/>
-                <w:szCs w:val="12"/>
-                <w:color w:val="000000"/>
-              </w:rPr>
-            </w:pPr>
-            <w:r>
-              <w:rPr>
-                <w:rFonts w:ascii="Arial" w:hAnsi="Arial" w:eastAsia="Arial" w:cs="Arial"/>
-                <w:i w:val="false"/>
-                <w:b w:val="false"/>
-                <w:u w:val="none"/>
-                <w:strike w:val="false"/>
-                <w:sz w:val="12"/>
-                <w:szCs w:val="12"/>
+                <w:sz w:val="8"/>
+                <w:szCs w:val="8"/>
+                <w:color w:val="000000"/>
+              </w:rPr>
+            </w:pPr>
+            <w:r>
+              <w:rPr>
+                <w:rFonts w:ascii="Arial" w:hAnsi="Arial" w:eastAsia="Arial" w:cs="Arial"/>
+                <w:i w:val="false"/>
+                <w:b w:val="false"/>
+                <w:u w:val="none"/>
+                <w:strike w:val="false"/>
+                <w:sz w:val="8"/>
+                <w:szCs w:val="8"/>
                 <w:color w:val="000000"/>
               </w:rPr>
               <w:t xml:space="preserve">Diagnóstico (AHA)</w:t>
@@ -4773,20 +4939,20 @@
                 <w:b w:val="false"/>
                 <w:u w:val="none"/>
                 <w:strike w:val="false"/>
-                <w:sz w:val="12"/>
-                <w:szCs w:val="12"/>
-                <w:color w:val="000000"/>
-              </w:rPr>
-            </w:pPr>
-            <w:r>
-              <w:rPr>
-                <w:rFonts w:ascii="Arial" w:hAnsi="Arial" w:eastAsia="Arial" w:cs="Arial"/>
-                <w:i w:val="false"/>
-                <w:b w:val="false"/>
-                <w:u w:val="none"/>
-                <w:strike w:val="false"/>
-                <w:sz w:val="12"/>
-                <w:szCs w:val="12"/>
+                <w:sz w:val="8"/>
+                <w:szCs w:val="8"/>
+                <w:color w:val="000000"/>
+              </w:rPr>
+            </w:pPr>
+            <w:r>
+              <w:rPr>
+                <w:rFonts w:ascii="Arial" w:hAnsi="Arial" w:eastAsia="Arial" w:cs="Arial"/>
+                <w:i w:val="false"/>
+                <w:b w:val="false"/>
+                <w:u w:val="none"/>
+                <w:strike w:val="false"/>
+                <w:sz w:val="8"/>
+                <w:szCs w:val="8"/>
                 <w:color w:val="000000"/>
               </w:rPr>
               <w:t xml:space="preserve">42,4</w:t>
@@ -4828,20 +4994,20 @@
                 <w:b w:val="false"/>
                 <w:u w:val="none"/>
                 <w:strike w:val="false"/>
-                <w:sz w:val="12"/>
-                <w:szCs w:val="12"/>
-                <w:color w:val="000000"/>
-              </w:rPr>
-            </w:pPr>
-            <w:r>
-              <w:rPr>
-                <w:rFonts w:ascii="Arial" w:hAnsi="Arial" w:eastAsia="Arial" w:cs="Arial"/>
-                <w:i w:val="false"/>
-                <w:b w:val="false"/>
-                <w:u w:val="none"/>
-                <w:strike w:val="false"/>
-                <w:sz w:val="12"/>
-                <w:szCs w:val="12"/>
+                <w:sz w:val="8"/>
+                <w:szCs w:val="8"/>
+                <w:color w:val="000000"/>
+              </w:rPr>
+            </w:pPr>
+            <w:r>
+              <w:rPr>
+                <w:rFonts w:ascii="Arial" w:hAnsi="Arial" w:eastAsia="Arial" w:cs="Arial"/>
+                <w:i w:val="false"/>
+                <w:b w:val="false"/>
+                <w:u w:val="none"/>
+                <w:strike w:val="false"/>
+                <w:sz w:val="8"/>
+                <w:szCs w:val="8"/>
                 <w:color w:val="000000"/>
               </w:rPr>
               <w:t xml:space="preserve">41,9</w:t>
@@ -4883,20 +5049,20 @@
                 <w:b w:val="false"/>
                 <w:u w:val="none"/>
                 <w:strike w:val="false"/>
-                <w:sz w:val="12"/>
-                <w:szCs w:val="12"/>
-                <w:color w:val="000000"/>
-              </w:rPr>
-            </w:pPr>
-            <w:r>
-              <w:rPr>
-                <w:rFonts w:ascii="Arial" w:hAnsi="Arial" w:eastAsia="Arial" w:cs="Arial"/>
-                <w:i w:val="false"/>
-                <w:b w:val="false"/>
-                <w:u w:val="none"/>
-                <w:strike w:val="false"/>
-                <w:sz w:val="12"/>
-                <w:szCs w:val="12"/>
+                <w:sz w:val="8"/>
+                <w:szCs w:val="8"/>
+                <w:color w:val="000000"/>
+              </w:rPr>
+            </w:pPr>
+            <w:r>
+              <w:rPr>
+                <w:rFonts w:ascii="Arial" w:hAnsi="Arial" w:eastAsia="Arial" w:cs="Arial"/>
+                <w:i w:val="false"/>
+                <w:b w:val="false"/>
+                <w:u w:val="none"/>
+                <w:strike w:val="false"/>
+                <w:sz w:val="8"/>
+                <w:szCs w:val="8"/>
                 <w:color w:val="000000"/>
               </w:rPr>
               <w:t xml:space="preserve">-0,44</w:t>
@@ -4938,20 +5104,20 @@
                 <w:b w:val="false"/>
                 <w:u w:val="none"/>
                 <w:strike w:val="false"/>
-                <w:sz w:val="12"/>
-                <w:szCs w:val="12"/>
-                <w:color w:val="000000"/>
-              </w:rPr>
-            </w:pPr>
-            <w:r>
-              <w:rPr>
-                <w:rFonts w:ascii="Arial" w:hAnsi="Arial" w:eastAsia="Arial" w:cs="Arial"/>
-                <w:i w:val="false"/>
-                <w:b w:val="false"/>
-                <w:u w:val="none"/>
-                <w:strike w:val="false"/>
-                <w:sz w:val="12"/>
-                <w:szCs w:val="12"/>
+                <w:sz w:val="8"/>
+                <w:szCs w:val="8"/>
+                <w:color w:val="000000"/>
+              </w:rPr>
+            </w:pPr>
+            <w:r>
+              <w:rPr>
+                <w:rFonts w:ascii="Arial" w:hAnsi="Arial" w:eastAsia="Arial" w:cs="Arial"/>
+                <w:i w:val="false"/>
+                <w:b w:val="false"/>
+                <w:u w:val="none"/>
+                <w:strike w:val="false"/>
+                <w:sz w:val="8"/>
+                <w:szCs w:val="8"/>
                 <w:color w:val="000000"/>
               </w:rPr>
               <w:t xml:space="preserve">42,9</w:t>
@@ -4993,20 +5159,20 @@
                 <w:b w:val="false"/>
                 <w:u w:val="none"/>
                 <w:strike w:val="false"/>
-                <w:sz w:val="12"/>
-                <w:szCs w:val="12"/>
-                <w:color w:val="000000"/>
-              </w:rPr>
-            </w:pPr>
-            <w:r>
-              <w:rPr>
-                <w:rFonts w:ascii="Arial" w:hAnsi="Arial" w:eastAsia="Arial" w:cs="Arial"/>
-                <w:i w:val="false"/>
-                <w:b w:val="false"/>
-                <w:u w:val="none"/>
-                <w:strike w:val="false"/>
-                <w:sz w:val="12"/>
-                <w:szCs w:val="12"/>
+                <w:sz w:val="8"/>
+                <w:szCs w:val="8"/>
+                <w:color w:val="000000"/>
+              </w:rPr>
+            </w:pPr>
+            <w:r>
+              <w:rPr>
+                <w:rFonts w:ascii="Arial" w:hAnsi="Arial" w:eastAsia="Arial" w:cs="Arial"/>
+                <w:i w:val="false"/>
+                <w:b w:val="false"/>
+                <w:u w:val="none"/>
+                <w:strike w:val="false"/>
+                <w:sz w:val="8"/>
+                <w:szCs w:val="8"/>
                 <w:color w:val="000000"/>
               </w:rPr>
               <w:t xml:space="preserve">42,6</w:t>
@@ -5048,20 +5214,75 @@
                 <w:b w:val="false"/>
                 <w:u w:val="none"/>
                 <w:strike w:val="false"/>
-                <w:sz w:val="12"/>
-                <w:szCs w:val="12"/>
-                <w:color w:val="000000"/>
-              </w:rPr>
-            </w:pPr>
-            <w:r>
-              <w:rPr>
-                <w:rFonts w:ascii="Arial" w:hAnsi="Arial" w:eastAsia="Arial" w:cs="Arial"/>
-                <w:i w:val="false"/>
-                <w:b w:val="false"/>
-                <w:u w:val="none"/>
-                <w:strike w:val="false"/>
-                <w:sz w:val="12"/>
-                <w:szCs w:val="12"/>
+                <w:sz w:val="8"/>
+                <w:szCs w:val="8"/>
+                <w:color w:val="000000"/>
+              </w:rPr>
+            </w:pPr>
+            <w:r>
+              <w:rPr>
+                <w:rFonts w:ascii="Arial" w:hAnsi="Arial" w:eastAsia="Arial" w:cs="Arial"/>
+                <w:i w:val="false"/>
+                <w:b w:val="false"/>
+                <w:u w:val="none"/>
+                <w:strike w:val="false"/>
+                <w:sz w:val="8"/>
+                <w:szCs w:val="8"/>
+                <w:color w:val="000000"/>
+              </w:rPr>
+              <w:t xml:space="preserve">1,22</w:t>
+            </w:r>
+          </w:p>
+        </w:tc>
+        <w:tc>
+          <w:tcPr>
+            <w:tcBorders>
+              <w:bottom w:val="none" w:sz="0" w:space="0" w:color="000000"/>
+              <w:top w:val="none" w:sz="0" w:space="0" w:color="000000"/>
+              <w:left w:val="none" w:sz="0" w:space="0" w:color="000000"/>
+              <w:right w:val="none" w:sz="0" w:space="0" w:color="000000"/>
+            </w:tcBorders>
+            <w:shd w:val="clear" w:color="auto" w:fill="FFFFFF"/>
+            <w:tcMar>
+              <w:top w:w="0" w:type="dxa"/>
+              <w:bottom w:w="0" w:type="dxa"/>
+              <w:left w:w="0" w:type="dxa"/>
+              <w:right w:w="0" w:type="dxa"/>
+            </w:tcMar>
+            <w:vAlign w:val="center"/>
+          </w:tcPr>
+          <w:p>
+            <w:pPr>
+              <w:pStyle w:val="Normal"/>
+              <w:jc w:val="center"/>
+              <w:pBdr>
+                <w:bottom w:val="none" w:sz="0" w:space="0" w:color="000000"/>
+                <w:top w:val="none" w:sz="0" w:space="0" w:color="000000"/>
+                <w:left w:val="none" w:sz="0" w:space="0" w:color="000000"/>
+                <w:right w:val="none" w:sz="0" w:space="0" w:color="000000"/>
+              </w:pBdr>
+              <w:spacing w:after="40" w:before="40" w:line="240"/>
+              <w:ind w:left="40" w:right="40" w:firstLine="0" w:firstLineChars="0"/>
+              <w:rPr>
+                <w:rFonts w:ascii="Arial" w:hAnsi="Arial" w:eastAsia="Arial" w:cs="Arial"/>
+                <w:i w:val="false"/>
+                <w:b w:val="false"/>
+                <w:u w:val="none"/>
+                <w:strike w:val="false"/>
+                <w:sz w:val="8"/>
+                <w:szCs w:val="8"/>
+                <w:color w:val="000000"/>
+              </w:rPr>
+            </w:pPr>
+            <w:r>
+              <w:rPr>
+                <w:rFonts w:ascii="Arial" w:hAnsi="Arial" w:eastAsia="Arial" w:cs="Arial"/>
+                <w:i w:val="false"/>
+                <w:b w:val="false"/>
+                <w:u w:val="none"/>
+                <w:strike w:val="false"/>
+                <w:sz w:val="8"/>
+                <w:szCs w:val="8"/>
                 <w:color w:val="000000"/>
               </w:rPr>
               <w:t xml:space="preserve">0,23</w:t>
@@ -5071,7 +5292,7 @@
       </w:tr>
       <w:tr>
         <w:trPr>
-          <w:trHeight w:val="224" w:hRule="auto"/>
+          <w:trHeight w:val="176" w:hRule="auto"/>
         </w:trPr>
         <w:tc>
           <w:tcPr>
@@ -5108,20 +5329,20 @@
                 <w:b w:val="false"/>
                 <w:u w:val="none"/>
                 <w:strike w:val="false"/>
-                <w:sz w:val="12"/>
-                <w:szCs w:val="12"/>
-                <w:color w:val="000000"/>
-              </w:rPr>
-            </w:pPr>
-            <w:r>
-              <w:rPr>
-                <w:rFonts w:ascii="Arial" w:hAnsi="Arial" w:eastAsia="Arial" w:cs="Arial"/>
-                <w:i w:val="false"/>
-                <w:b w:val="false"/>
-                <w:u w:val="none"/>
-                <w:strike w:val="false"/>
-                <w:sz w:val="12"/>
-                <w:szCs w:val="12"/>
+                <w:sz w:val="8"/>
+                <w:szCs w:val="8"/>
+                <w:color w:val="000000"/>
+              </w:rPr>
+            </w:pPr>
+            <w:r>
+              <w:rPr>
+                <w:rFonts w:ascii="Arial" w:hAnsi="Arial" w:eastAsia="Arial" w:cs="Arial"/>
+                <w:i w:val="false"/>
+                <w:b w:val="false"/>
+                <w:u w:val="none"/>
+                <w:strike w:val="false"/>
+                <w:sz w:val="8"/>
+                <w:szCs w:val="8"/>
                 <w:color w:val="000000"/>
               </w:rPr>
               <w:t xml:space="preserve">Tratamiento</w:t>
@@ -5163,20 +5384,20 @@
                 <w:b w:val="false"/>
                 <w:u w:val="none"/>
                 <w:strike w:val="false"/>
-                <w:sz w:val="12"/>
-                <w:szCs w:val="12"/>
-                <w:color w:val="000000"/>
-              </w:rPr>
-            </w:pPr>
-            <w:r>
-              <w:rPr>
-                <w:rFonts w:ascii="Arial" w:hAnsi="Arial" w:eastAsia="Arial" w:cs="Arial"/>
-                <w:i w:val="false"/>
-                <w:b w:val="false"/>
-                <w:u w:val="none"/>
-                <w:strike w:val="false"/>
-                <w:sz w:val="12"/>
-                <w:szCs w:val="12"/>
+                <w:sz w:val="8"/>
+                <w:szCs w:val="8"/>
+                <w:color w:val="000000"/>
+              </w:rPr>
+            </w:pPr>
+            <w:r>
+              <w:rPr>
+                <w:rFonts w:ascii="Arial" w:hAnsi="Arial" w:eastAsia="Arial" w:cs="Arial"/>
+                <w:i w:val="false"/>
+                <w:b w:val="false"/>
+                <w:u w:val="none"/>
+                <w:strike w:val="false"/>
+                <w:sz w:val="8"/>
+                <w:szCs w:val="8"/>
                 <w:color w:val="000000"/>
               </w:rPr>
               <w:t xml:space="preserve">82,1</w:t>
@@ -5218,20 +5439,20 @@
                 <w:b w:val="false"/>
                 <w:u w:val="none"/>
                 <w:strike w:val="false"/>
-                <w:sz w:val="12"/>
-                <w:szCs w:val="12"/>
-                <w:color w:val="000000"/>
-              </w:rPr>
-            </w:pPr>
-            <w:r>
-              <w:rPr>
-                <w:rFonts w:ascii="Arial" w:hAnsi="Arial" w:eastAsia="Arial" w:cs="Arial"/>
-                <w:i w:val="false"/>
-                <w:b w:val="false"/>
-                <w:u w:val="none"/>
-                <w:strike w:val="false"/>
-                <w:sz w:val="12"/>
-                <w:szCs w:val="12"/>
+                <w:sz w:val="8"/>
+                <w:szCs w:val="8"/>
+                <w:color w:val="000000"/>
+              </w:rPr>
+            </w:pPr>
+            <w:r>
+              <w:rPr>
+                <w:rFonts w:ascii="Arial" w:hAnsi="Arial" w:eastAsia="Arial" w:cs="Arial"/>
+                <w:i w:val="false"/>
+                <w:b w:val="false"/>
+                <w:u w:val="none"/>
+                <w:strike w:val="false"/>
+                <w:sz w:val="8"/>
+                <w:szCs w:val="8"/>
                 <w:color w:val="000000"/>
               </w:rPr>
               <w:t xml:space="preserve">81,0</w:t>
@@ -5273,20 +5494,20 @@
                 <w:b w:val="false"/>
                 <w:u w:val="none"/>
                 <w:strike w:val="false"/>
-                <w:sz w:val="12"/>
-                <w:szCs w:val="12"/>
-                <w:color w:val="000000"/>
-              </w:rPr>
-            </w:pPr>
-            <w:r>
-              <w:rPr>
-                <w:rFonts w:ascii="Arial" w:hAnsi="Arial" w:eastAsia="Arial" w:cs="Arial"/>
-                <w:i w:val="false"/>
-                <w:b w:val="false"/>
-                <w:u w:val="none"/>
-                <w:strike w:val="false"/>
-                <w:sz w:val="12"/>
-                <w:szCs w:val="12"/>
+                <w:sz w:val="8"/>
+                <w:szCs w:val="8"/>
+                <w:color w:val="000000"/>
+              </w:rPr>
+            </w:pPr>
+            <w:r>
+              <w:rPr>
+                <w:rFonts w:ascii="Arial" w:hAnsi="Arial" w:eastAsia="Arial" w:cs="Arial"/>
+                <w:i w:val="false"/>
+                <w:b w:val="false"/>
+                <w:u w:val="none"/>
+                <w:strike w:val="false"/>
+                <w:sz w:val="8"/>
+                <w:szCs w:val="8"/>
                 <w:color w:val="000000"/>
               </w:rPr>
               <w:t xml:space="preserve">-1,16</w:t>
@@ -5328,20 +5549,20 @@
                 <w:b w:val="false"/>
                 <w:u w:val="none"/>
                 <w:strike w:val="false"/>
-                <w:sz w:val="12"/>
-                <w:szCs w:val="12"/>
-                <w:color w:val="000000"/>
-              </w:rPr>
-            </w:pPr>
-            <w:r>
-              <w:rPr>
-                <w:rFonts w:ascii="Arial" w:hAnsi="Arial" w:eastAsia="Arial" w:cs="Arial"/>
-                <w:i w:val="false"/>
-                <w:b w:val="false"/>
-                <w:u w:val="none"/>
-                <w:strike w:val="false"/>
-                <w:sz w:val="12"/>
-                <w:szCs w:val="12"/>
+                <w:sz w:val="8"/>
+                <w:szCs w:val="8"/>
+                <w:color w:val="000000"/>
+              </w:rPr>
+            </w:pPr>
+            <w:r>
+              <w:rPr>
+                <w:rFonts w:ascii="Arial" w:hAnsi="Arial" w:eastAsia="Arial" w:cs="Arial"/>
+                <w:i w:val="false"/>
+                <w:b w:val="false"/>
+                <w:u w:val="none"/>
+                <w:strike w:val="false"/>
+                <w:sz w:val="8"/>
+                <w:szCs w:val="8"/>
                 <w:color w:val="000000"/>
               </w:rPr>
               <w:t xml:space="preserve">80,3</w:t>
@@ -5383,20 +5604,20 @@
                 <w:b w:val="false"/>
                 <w:u w:val="none"/>
                 <w:strike w:val="false"/>
-                <w:sz w:val="12"/>
-                <w:szCs w:val="12"/>
-                <w:color w:val="000000"/>
-              </w:rPr>
-            </w:pPr>
-            <w:r>
-              <w:rPr>
-                <w:rFonts w:ascii="Arial" w:hAnsi="Arial" w:eastAsia="Arial" w:cs="Arial"/>
-                <w:i w:val="false"/>
-                <w:b w:val="false"/>
-                <w:u w:val="none"/>
-                <w:strike w:val="false"/>
-                <w:sz w:val="12"/>
-                <w:szCs w:val="12"/>
+                <w:sz w:val="8"/>
+                <w:szCs w:val="8"/>
+                <w:color w:val="000000"/>
+              </w:rPr>
+            </w:pPr>
+            <w:r>
+              <w:rPr>
+                <w:rFonts w:ascii="Arial" w:hAnsi="Arial" w:eastAsia="Arial" w:cs="Arial"/>
+                <w:i w:val="false"/>
+                <w:b w:val="false"/>
+                <w:u w:val="none"/>
+                <w:strike w:val="false"/>
+                <w:sz w:val="8"/>
+                <w:szCs w:val="8"/>
                 <w:color w:val="000000"/>
               </w:rPr>
               <w:t xml:space="preserve">80,5</w:t>
@@ -5438,20 +5659,75 @@
                 <w:b w:val="false"/>
                 <w:u w:val="none"/>
                 <w:strike w:val="false"/>
-                <w:sz w:val="12"/>
-                <w:szCs w:val="12"/>
-                <w:color w:val="000000"/>
-              </w:rPr>
-            </w:pPr>
-            <w:r>
-              <w:rPr>
-                <w:rFonts w:ascii="Arial" w:hAnsi="Arial" w:eastAsia="Arial" w:cs="Arial"/>
-                <w:i w:val="false"/>
-                <w:b w:val="false"/>
-                <w:u w:val="none"/>
-                <w:strike w:val="false"/>
-                <w:sz w:val="12"/>
-                <w:szCs w:val="12"/>
+                <w:sz w:val="8"/>
+                <w:szCs w:val="8"/>
+                <w:color w:val="000000"/>
+              </w:rPr>
+            </w:pPr>
+            <w:r>
+              <w:rPr>
+                <w:rFonts w:ascii="Arial" w:hAnsi="Arial" w:eastAsia="Arial" w:cs="Arial"/>
+                <w:i w:val="false"/>
+                <w:b w:val="false"/>
+                <w:u w:val="none"/>
+                <w:strike w:val="false"/>
+                <w:sz w:val="8"/>
+                <w:szCs w:val="8"/>
+                <w:color w:val="000000"/>
+              </w:rPr>
+              <w:t xml:space="preserve">0,64</w:t>
+            </w:r>
+          </w:p>
+        </w:tc>
+        <w:tc>
+          <w:tcPr>
+            <w:tcBorders>
+              <w:bottom w:val="none" w:sz="0" w:space="0" w:color="000000"/>
+              <w:top w:val="none" w:sz="0" w:space="0" w:color="000000"/>
+              <w:left w:val="none" w:sz="0" w:space="0" w:color="000000"/>
+              <w:right w:val="none" w:sz="0" w:space="0" w:color="000000"/>
+            </w:tcBorders>
+            <w:shd w:val="clear" w:color="auto" w:fill="FFFFFF"/>
+            <w:tcMar>
+              <w:top w:w="0" w:type="dxa"/>
+              <w:bottom w:w="0" w:type="dxa"/>
+              <w:left w:w="0" w:type="dxa"/>
+              <w:right w:w="0" w:type="dxa"/>
+            </w:tcMar>
+            <w:vAlign w:val="center"/>
+          </w:tcPr>
+          <w:p>
+            <w:pPr>
+              <w:pStyle w:val="Normal"/>
+              <w:jc w:val="center"/>
+              <w:pBdr>
+                <w:bottom w:val="none" w:sz="0" w:space="0" w:color="000000"/>
+                <w:top w:val="none" w:sz="0" w:space="0" w:color="000000"/>
+                <w:left w:val="none" w:sz="0" w:space="0" w:color="000000"/>
+                <w:right w:val="none" w:sz="0" w:space="0" w:color="000000"/>
+              </w:pBdr>
+              <w:spacing w:after="40" w:before="40" w:line="240"/>
+              <w:ind w:left="40" w:right="40" w:firstLine="0" w:firstLineChars="0"/>
+              <w:rPr>
+                <w:rFonts w:ascii="Arial" w:hAnsi="Arial" w:eastAsia="Arial" w:cs="Arial"/>
+                <w:i w:val="false"/>
+                <w:b w:val="false"/>
+                <w:u w:val="none"/>
+                <w:strike w:val="false"/>
+                <w:sz w:val="8"/>
+                <w:szCs w:val="8"/>
+                <w:color w:val="000000"/>
+              </w:rPr>
+            </w:pPr>
+            <w:r>
+              <w:rPr>
+                <w:rFonts w:ascii="Arial" w:hAnsi="Arial" w:eastAsia="Arial" w:cs="Arial"/>
+                <w:i w:val="false"/>
+                <w:b w:val="false"/>
+                <w:u w:val="none"/>
+                <w:strike w:val="false"/>
+                <w:sz w:val="8"/>
+                <w:szCs w:val="8"/>
                 <w:color w:val="000000"/>
               </w:rPr>
               <w:t xml:space="preserve">-0,13</w:t>
@@ -5461,7 +5737,7 @@
       </w:tr>
       <w:tr>
         <w:trPr>
-          <w:trHeight w:val="224" w:hRule="auto"/>
+          <w:trHeight w:val="176" w:hRule="auto"/>
         </w:trPr>
         <w:tc>
           <w:tcPr>
@@ -5498,20 +5774,20 @@
                 <w:b w:val="false"/>
                 <w:u w:val="none"/>
                 <w:strike w:val="false"/>
-                <w:sz w:val="12"/>
-                <w:szCs w:val="12"/>
-                <w:color w:val="000000"/>
-              </w:rPr>
-            </w:pPr>
-            <w:r>
-              <w:rPr>
-                <w:rFonts w:ascii="Arial" w:hAnsi="Arial" w:eastAsia="Arial" w:cs="Arial"/>
-                <w:i w:val="false"/>
-                <w:b w:val="false"/>
-                <w:u w:val="none"/>
-                <w:strike w:val="false"/>
-                <w:sz w:val="12"/>
-                <w:szCs w:val="12"/>
+                <w:sz w:val="8"/>
+                <w:szCs w:val="8"/>
+                <w:color w:val="000000"/>
+              </w:rPr>
+            </w:pPr>
+            <w:r>
+              <w:rPr>
+                <w:rFonts w:ascii="Arial" w:hAnsi="Arial" w:eastAsia="Arial" w:cs="Arial"/>
+                <w:i w:val="false"/>
+                <w:b w:val="false"/>
+                <w:u w:val="none"/>
+                <w:strike w:val="false"/>
+                <w:sz w:val="8"/>
+                <w:szCs w:val="8"/>
                 <w:color w:val="000000"/>
               </w:rPr>
               <w:t xml:space="preserve">Control (ESH)</w:t>
@@ -5553,20 +5829,20 @@
                 <w:b w:val="false"/>
                 <w:u w:val="none"/>
                 <w:strike w:val="false"/>
-                <w:sz w:val="12"/>
-                <w:szCs w:val="12"/>
-                <w:color w:val="000000"/>
-              </w:rPr>
-            </w:pPr>
-            <w:r>
-              <w:rPr>
-                <w:rFonts w:ascii="Arial" w:hAnsi="Arial" w:eastAsia="Arial" w:cs="Arial"/>
-                <w:i w:val="false"/>
-                <w:b w:val="false"/>
-                <w:u w:val="none"/>
-                <w:strike w:val="false"/>
-                <w:sz w:val="12"/>
-                <w:szCs w:val="12"/>
+                <w:sz w:val="8"/>
+                <w:szCs w:val="8"/>
+                <w:color w:val="000000"/>
+              </w:rPr>
+            </w:pPr>
+            <w:r>
+              <w:rPr>
+                <w:rFonts w:ascii="Arial" w:hAnsi="Arial" w:eastAsia="Arial" w:cs="Arial"/>
+                <w:i w:val="false"/>
+                <w:b w:val="false"/>
+                <w:u w:val="none"/>
+                <w:strike w:val="false"/>
+                <w:sz w:val="8"/>
+                <w:szCs w:val="8"/>
                 <w:color w:val="000000"/>
               </w:rPr>
               <w:t xml:space="preserve">63,1</w:t>
@@ -5608,20 +5884,20 @@
                 <w:b w:val="false"/>
                 <w:u w:val="none"/>
                 <w:strike w:val="false"/>
-                <w:sz w:val="12"/>
-                <w:szCs w:val="12"/>
-                <w:color w:val="000000"/>
-              </w:rPr>
-            </w:pPr>
-            <w:r>
-              <w:rPr>
-                <w:rFonts w:ascii="Arial" w:hAnsi="Arial" w:eastAsia="Arial" w:cs="Arial"/>
-                <w:i w:val="false"/>
-                <w:b w:val="false"/>
-                <w:u w:val="none"/>
-                <w:strike w:val="false"/>
-                <w:sz w:val="12"/>
-                <w:szCs w:val="12"/>
+                <w:sz w:val="8"/>
+                <w:szCs w:val="8"/>
+                <w:color w:val="000000"/>
+              </w:rPr>
+            </w:pPr>
+            <w:r>
+              <w:rPr>
+                <w:rFonts w:ascii="Arial" w:hAnsi="Arial" w:eastAsia="Arial" w:cs="Arial"/>
+                <w:i w:val="false"/>
+                <w:b w:val="false"/>
+                <w:u w:val="none"/>
+                <w:strike w:val="false"/>
+                <w:sz w:val="8"/>
+                <w:szCs w:val="8"/>
                 <w:color w:val="000000"/>
               </w:rPr>
               <w:t xml:space="preserve">64,0</w:t>
@@ -5663,20 +5939,20 @@
                 <w:b w:val="false"/>
                 <w:u w:val="none"/>
                 <w:strike w:val="false"/>
-                <w:sz w:val="12"/>
-                <w:szCs w:val="12"/>
-                <w:color w:val="000000"/>
-              </w:rPr>
-            </w:pPr>
-            <w:r>
-              <w:rPr>
-                <w:rFonts w:ascii="Arial" w:hAnsi="Arial" w:eastAsia="Arial" w:cs="Arial"/>
-                <w:i w:val="false"/>
-                <w:b w:val="false"/>
-                <w:u w:val="none"/>
-                <w:strike w:val="false"/>
-                <w:sz w:val="12"/>
-                <w:szCs w:val="12"/>
+                <w:sz w:val="8"/>
+                <w:szCs w:val="8"/>
+                <w:color w:val="000000"/>
+              </w:rPr>
+            </w:pPr>
+            <w:r>
+              <w:rPr>
+                <w:rFonts w:ascii="Arial" w:hAnsi="Arial" w:eastAsia="Arial" w:cs="Arial"/>
+                <w:i w:val="false"/>
+                <w:b w:val="false"/>
+                <w:u w:val="none"/>
+                <w:strike w:val="false"/>
+                <w:sz w:val="8"/>
+                <w:szCs w:val="8"/>
                 <w:color w:val="000000"/>
               </w:rPr>
               <w:t xml:space="preserve">0,89</w:t>
@@ -5718,20 +5994,20 @@
                 <w:b w:val="false"/>
                 <w:u w:val="none"/>
                 <w:strike w:val="false"/>
-                <w:sz w:val="12"/>
-                <w:szCs w:val="12"/>
-                <w:color w:val="000000"/>
-              </w:rPr>
-            </w:pPr>
-            <w:r>
-              <w:rPr>
-                <w:rFonts w:ascii="Arial" w:hAnsi="Arial" w:eastAsia="Arial" w:cs="Arial"/>
-                <w:i w:val="false"/>
-                <w:b w:val="false"/>
-                <w:u w:val="none"/>
-                <w:strike w:val="false"/>
-                <w:sz w:val="12"/>
-                <w:szCs w:val="12"/>
+                <w:sz w:val="8"/>
+                <w:szCs w:val="8"/>
+                <w:color w:val="000000"/>
+              </w:rPr>
+            </w:pPr>
+            <w:r>
+              <w:rPr>
+                <w:rFonts w:ascii="Arial" w:hAnsi="Arial" w:eastAsia="Arial" w:cs="Arial"/>
+                <w:i w:val="false"/>
+                <w:b w:val="false"/>
+                <w:u w:val="none"/>
+                <w:strike w:val="false"/>
+                <w:sz w:val="8"/>
+                <w:szCs w:val="8"/>
                 <w:color w:val="000000"/>
               </w:rPr>
               <w:t xml:space="preserve">58,2</w:t>
@@ -5773,20 +6049,20 @@
                 <w:b w:val="false"/>
                 <w:u w:val="none"/>
                 <w:strike w:val="false"/>
-                <w:sz w:val="12"/>
-                <w:szCs w:val="12"/>
-                <w:color w:val="000000"/>
-              </w:rPr>
-            </w:pPr>
-            <w:r>
-              <w:rPr>
-                <w:rFonts w:ascii="Arial" w:hAnsi="Arial" w:eastAsia="Arial" w:cs="Arial"/>
-                <w:i w:val="false"/>
-                <w:b w:val="false"/>
-                <w:u w:val="none"/>
-                <w:strike w:val="false"/>
-                <w:sz w:val="12"/>
-                <w:szCs w:val="12"/>
+                <w:sz w:val="8"/>
+                <w:szCs w:val="8"/>
+                <w:color w:val="000000"/>
+              </w:rPr>
+            </w:pPr>
+            <w:r>
+              <w:rPr>
+                <w:rFonts w:ascii="Arial" w:hAnsi="Arial" w:eastAsia="Arial" w:cs="Arial"/>
+                <w:i w:val="false"/>
+                <w:b w:val="false"/>
+                <w:u w:val="none"/>
+                <w:strike w:val="false"/>
+                <w:sz w:val="8"/>
+                <w:szCs w:val="8"/>
                 <w:color w:val="000000"/>
               </w:rPr>
               <w:t xml:space="preserve">59,1</w:t>
@@ -5828,20 +6104,75 @@
                 <w:b w:val="false"/>
                 <w:u w:val="none"/>
                 <w:strike w:val="false"/>
-                <w:sz w:val="12"/>
-                <w:szCs w:val="12"/>
-                <w:color w:val="000000"/>
-              </w:rPr>
-            </w:pPr>
-            <w:r>
-              <w:rPr>
-                <w:rFonts w:ascii="Arial" w:hAnsi="Arial" w:eastAsia="Arial" w:cs="Arial"/>
-                <w:i w:val="false"/>
-                <w:b w:val="false"/>
-                <w:u w:val="none"/>
-                <w:strike w:val="false"/>
-                <w:sz w:val="12"/>
-                <w:szCs w:val="12"/>
+                <w:sz w:val="8"/>
+                <w:szCs w:val="8"/>
+                <w:color w:val="000000"/>
+              </w:rPr>
+            </w:pPr>
+            <w:r>
+              <w:rPr>
+                <w:rFonts w:ascii="Arial" w:hAnsi="Arial" w:eastAsia="Arial" w:cs="Arial"/>
+                <w:i w:val="false"/>
+                <w:b w:val="false"/>
+                <w:u w:val="none"/>
+                <w:strike w:val="false"/>
+                <w:sz w:val="8"/>
+                <w:szCs w:val="8"/>
+                <w:color w:val="000000"/>
+              </w:rPr>
+              <w:t xml:space="preserve">-0,87</w:t>
+            </w:r>
+          </w:p>
+        </w:tc>
+        <w:tc>
+          <w:tcPr>
+            <w:tcBorders>
+              <w:bottom w:val="none" w:sz="0" w:space="0" w:color="000000"/>
+              <w:top w:val="none" w:sz="0" w:space="0" w:color="000000"/>
+              <w:left w:val="none" w:sz="0" w:space="0" w:color="000000"/>
+              <w:right w:val="none" w:sz="0" w:space="0" w:color="000000"/>
+            </w:tcBorders>
+            <w:shd w:val="clear" w:color="auto" w:fill="FFFFFF"/>
+            <w:tcMar>
+              <w:top w:w="0" w:type="dxa"/>
+              <w:bottom w:w="0" w:type="dxa"/>
+              <w:left w:w="0" w:type="dxa"/>
+              <w:right w:w="0" w:type="dxa"/>
+            </w:tcMar>
+            <w:vAlign w:val="center"/>
+          </w:tcPr>
+          <w:p>
+            <w:pPr>
+              <w:pStyle w:val="Normal"/>
+              <w:jc w:val="center"/>
+              <w:pBdr>
+                <w:bottom w:val="none" w:sz="0" w:space="0" w:color="000000"/>
+                <w:top w:val="none" w:sz="0" w:space="0" w:color="000000"/>
+                <w:left w:val="none" w:sz="0" w:space="0" w:color="000000"/>
+                <w:right w:val="none" w:sz="0" w:space="0" w:color="000000"/>
+              </w:pBdr>
+              <w:spacing w:after="40" w:before="40" w:line="240"/>
+              <w:ind w:left="40" w:right="40" w:firstLine="0" w:firstLineChars="0"/>
+              <w:rPr>
+                <w:rFonts w:ascii="Arial" w:hAnsi="Arial" w:eastAsia="Arial" w:cs="Arial"/>
+                <w:i w:val="false"/>
+                <w:b w:val="false"/>
+                <w:u w:val="none"/>
+                <w:strike w:val="false"/>
+                <w:sz w:val="8"/>
+                <w:szCs w:val="8"/>
+                <w:color w:val="000000"/>
+              </w:rPr>
+            </w:pPr>
+            <w:r>
+              <w:rPr>
+                <w:rFonts w:ascii="Arial" w:hAnsi="Arial" w:eastAsia="Arial" w:cs="Arial"/>
+                <w:i w:val="false"/>
+                <w:b w:val="false"/>
+                <w:u w:val="none"/>
+                <w:strike w:val="false"/>
+                <w:sz w:val="8"/>
+                <w:szCs w:val="8"/>
                 <w:color w:val="000000"/>
               </w:rPr>
               <w:t xml:space="preserve">-0,83</w:t>
@@ -5851,7 +6182,7 @@
       </w:tr>
       <w:tr>
         <w:trPr>
-          <w:trHeight w:val="224" w:hRule="auto"/>
+          <w:trHeight w:val="176" w:hRule="auto"/>
         </w:trPr>
         <w:tc>
           <w:tcPr>
@@ -5888,20 +6219,20 @@
                 <w:b w:val="false"/>
                 <w:u w:val="none"/>
                 <w:strike w:val="false"/>
-                <w:sz w:val="12"/>
-                <w:szCs w:val="12"/>
-                <w:color w:val="000000"/>
-              </w:rPr>
-            </w:pPr>
-            <w:r>
-              <w:rPr>
-                <w:rFonts w:ascii="Arial" w:hAnsi="Arial" w:eastAsia="Arial" w:cs="Arial"/>
-                <w:i w:val="false"/>
-                <w:b w:val="false"/>
-                <w:u w:val="none"/>
-                <w:strike w:val="false"/>
-                <w:sz w:val="12"/>
-                <w:szCs w:val="12"/>
+                <w:sz w:val="8"/>
+                <w:szCs w:val="8"/>
+                <w:color w:val="000000"/>
+              </w:rPr>
+            </w:pPr>
+            <w:r>
+              <w:rPr>
+                <w:rFonts w:ascii="Arial" w:hAnsi="Arial" w:eastAsia="Arial" w:cs="Arial"/>
+                <w:i w:val="false"/>
+                <w:b w:val="false"/>
+                <w:u w:val="none"/>
+                <w:strike w:val="false"/>
+                <w:sz w:val="8"/>
+                <w:szCs w:val="8"/>
                 <w:color w:val="000000"/>
               </w:rPr>
               <w:t xml:space="preserve">Control (AHA)</w:t>
@@ -5943,20 +6274,20 @@
                 <w:b w:val="false"/>
                 <w:u w:val="none"/>
                 <w:strike w:val="false"/>
-                <w:sz w:val="12"/>
-                <w:szCs w:val="12"/>
-                <w:color w:val="000000"/>
-              </w:rPr>
-            </w:pPr>
-            <w:r>
-              <w:rPr>
-                <w:rFonts w:ascii="Arial" w:hAnsi="Arial" w:eastAsia="Arial" w:cs="Arial"/>
-                <w:i w:val="false"/>
-                <w:b w:val="false"/>
-                <w:u w:val="none"/>
-                <w:strike w:val="false"/>
-                <w:sz w:val="12"/>
-                <w:szCs w:val="12"/>
+                <w:sz w:val="8"/>
+                <w:szCs w:val="8"/>
+                <w:color w:val="000000"/>
+              </w:rPr>
+            </w:pPr>
+            <w:r>
+              <w:rPr>
+                <w:rFonts w:ascii="Arial" w:hAnsi="Arial" w:eastAsia="Arial" w:cs="Arial"/>
+                <w:i w:val="false"/>
+                <w:b w:val="false"/>
+                <w:u w:val="none"/>
+                <w:strike w:val="false"/>
+                <w:sz w:val="8"/>
+                <w:szCs w:val="8"/>
                 <w:color w:val="000000"/>
               </w:rPr>
               <w:t xml:space="preserve">39,6</w:t>
@@ -5998,20 +6329,20 @@
                 <w:b w:val="false"/>
                 <w:u w:val="none"/>
                 <w:strike w:val="false"/>
-                <w:sz w:val="12"/>
-                <w:szCs w:val="12"/>
-                <w:color w:val="000000"/>
-              </w:rPr>
-            </w:pPr>
-            <w:r>
-              <w:rPr>
-                <w:rFonts w:ascii="Arial" w:hAnsi="Arial" w:eastAsia="Arial" w:cs="Arial"/>
-                <w:i w:val="false"/>
-                <w:b w:val="false"/>
-                <w:u w:val="none"/>
-                <w:strike w:val="false"/>
-                <w:sz w:val="12"/>
-                <w:szCs w:val="12"/>
+                <w:sz w:val="8"/>
+                <w:szCs w:val="8"/>
+                <w:color w:val="000000"/>
+              </w:rPr>
+            </w:pPr>
+            <w:r>
+              <w:rPr>
+                <w:rFonts w:ascii="Arial" w:hAnsi="Arial" w:eastAsia="Arial" w:cs="Arial"/>
+                <w:i w:val="false"/>
+                <w:b w:val="false"/>
+                <w:u w:val="none"/>
+                <w:strike w:val="false"/>
+                <w:sz w:val="8"/>
+                <w:szCs w:val="8"/>
                 <w:color w:val="000000"/>
               </w:rPr>
               <w:t xml:space="preserve">40,6</w:t>
@@ -6053,20 +6384,20 @@
                 <w:b w:val="false"/>
                 <w:u w:val="none"/>
                 <w:strike w:val="false"/>
-                <w:sz w:val="12"/>
-                <w:szCs w:val="12"/>
-                <w:color w:val="000000"/>
-              </w:rPr>
-            </w:pPr>
-            <w:r>
-              <w:rPr>
-                <w:rFonts w:ascii="Arial" w:hAnsi="Arial" w:eastAsia="Arial" w:cs="Arial"/>
-                <w:i w:val="false"/>
-                <w:b w:val="false"/>
-                <w:u w:val="none"/>
-                <w:strike w:val="false"/>
-                <w:sz w:val="12"/>
-                <w:szCs w:val="12"/>
+                <w:sz w:val="8"/>
+                <w:szCs w:val="8"/>
+                <w:color w:val="000000"/>
+              </w:rPr>
+            </w:pPr>
+            <w:r>
+              <w:rPr>
+                <w:rFonts w:ascii="Arial" w:hAnsi="Arial" w:eastAsia="Arial" w:cs="Arial"/>
+                <w:i w:val="false"/>
+                <w:b w:val="false"/>
+                <w:u w:val="none"/>
+                <w:strike w:val="false"/>
+                <w:sz w:val="8"/>
+                <w:szCs w:val="8"/>
                 <w:color w:val="000000"/>
               </w:rPr>
               <w:t xml:space="preserve">1,02</w:t>
@@ -6108,20 +6439,20 @@
                 <w:b w:val="false"/>
                 <w:u w:val="none"/>
                 <w:strike w:val="false"/>
-                <w:sz w:val="12"/>
-                <w:szCs w:val="12"/>
-                <w:color w:val="000000"/>
-              </w:rPr>
-            </w:pPr>
-            <w:r>
-              <w:rPr>
-                <w:rFonts w:ascii="Arial" w:hAnsi="Arial" w:eastAsia="Arial" w:cs="Arial"/>
-                <w:i w:val="false"/>
-                <w:b w:val="false"/>
-                <w:u w:val="none"/>
-                <w:strike w:val="false"/>
-                <w:sz w:val="12"/>
-                <w:szCs w:val="12"/>
+                <w:sz w:val="8"/>
+                <w:szCs w:val="8"/>
+                <w:color w:val="000000"/>
+              </w:rPr>
+            </w:pPr>
+            <w:r>
+              <w:rPr>
+                <w:rFonts w:ascii="Arial" w:hAnsi="Arial" w:eastAsia="Arial" w:cs="Arial"/>
+                <w:i w:val="false"/>
+                <w:b w:val="false"/>
+                <w:u w:val="none"/>
+                <w:strike w:val="false"/>
+                <w:sz w:val="8"/>
+                <w:szCs w:val="8"/>
                 <w:color w:val="000000"/>
               </w:rPr>
               <w:t xml:space="preserve">35,4</w:t>
@@ -6163,20 +6494,20 @@
                 <w:b w:val="false"/>
                 <w:u w:val="none"/>
                 <w:strike w:val="false"/>
-                <w:sz w:val="12"/>
-                <w:szCs w:val="12"/>
-                <w:color w:val="000000"/>
-              </w:rPr>
-            </w:pPr>
-            <w:r>
-              <w:rPr>
-                <w:rFonts w:ascii="Arial" w:hAnsi="Arial" w:eastAsia="Arial" w:cs="Arial"/>
-                <w:i w:val="false"/>
-                <w:b w:val="false"/>
-                <w:u w:val="none"/>
-                <w:strike w:val="false"/>
-                <w:sz w:val="12"/>
-                <w:szCs w:val="12"/>
+                <w:sz w:val="8"/>
+                <w:szCs w:val="8"/>
+                <w:color w:val="000000"/>
+              </w:rPr>
+            </w:pPr>
+            <w:r>
+              <w:rPr>
+                <w:rFonts w:ascii="Arial" w:hAnsi="Arial" w:eastAsia="Arial" w:cs="Arial"/>
+                <w:i w:val="false"/>
+                <w:b w:val="false"/>
+                <w:u w:val="none"/>
+                <w:strike w:val="false"/>
+                <w:sz w:val="8"/>
+                <w:szCs w:val="8"/>
                 <w:color w:val="000000"/>
               </w:rPr>
               <w:t xml:space="preserve">36,4</w:t>
@@ -6218,23 +6549,523 @@
                 <w:b w:val="false"/>
                 <w:u w:val="none"/>
                 <w:strike w:val="false"/>
-                <w:sz w:val="12"/>
-                <w:szCs w:val="12"/>
-                <w:color w:val="000000"/>
-              </w:rPr>
-            </w:pPr>
-            <w:r>
-              <w:rPr>
-                <w:rFonts w:ascii="Arial" w:hAnsi="Arial" w:eastAsia="Arial" w:cs="Arial"/>
-                <w:i w:val="false"/>
-                <w:b w:val="false"/>
-                <w:u w:val="none"/>
-                <w:strike w:val="false"/>
-                <w:sz w:val="12"/>
-                <w:szCs w:val="12"/>
+                <w:sz w:val="8"/>
+                <w:szCs w:val="8"/>
+                <w:color w:val="000000"/>
+              </w:rPr>
+            </w:pPr>
+            <w:r>
+              <w:rPr>
+                <w:rFonts w:ascii="Arial" w:hAnsi="Arial" w:eastAsia="Arial" w:cs="Arial"/>
+                <w:i w:val="false"/>
+                <w:b w:val="false"/>
+                <w:u w:val="none"/>
+                <w:strike w:val="false"/>
+                <w:sz w:val="8"/>
+                <w:szCs w:val="8"/>
+                <w:color w:val="000000"/>
+              </w:rPr>
+              <w:t xml:space="preserve">-1,15</w:t>
+            </w:r>
+          </w:p>
+        </w:tc>
+        <w:tc>
+          <w:tcPr>
+            <w:tcBorders>
+              <w:bottom w:val="none" w:sz="0" w:space="0" w:color="000000"/>
+              <w:top w:val="none" w:sz="0" w:space="0" w:color="000000"/>
+              <w:left w:val="none" w:sz="0" w:space="0" w:color="000000"/>
+              <w:right w:val="none" w:sz="0" w:space="0" w:color="000000"/>
+            </w:tcBorders>
+            <w:shd w:val="clear" w:color="auto" w:fill="FFFFFF"/>
+            <w:tcMar>
+              <w:top w:w="0" w:type="dxa"/>
+              <w:bottom w:w="0" w:type="dxa"/>
+              <w:left w:w="0" w:type="dxa"/>
+              <w:right w:w="0" w:type="dxa"/>
+            </w:tcMar>
+            <w:vAlign w:val="center"/>
+          </w:tcPr>
+          <w:p>
+            <w:pPr>
+              <w:pStyle w:val="Normal"/>
+              <w:jc w:val="center"/>
+              <w:pBdr>
+                <w:bottom w:val="none" w:sz="0" w:space="0" w:color="000000"/>
+                <w:top w:val="none" w:sz="0" w:space="0" w:color="000000"/>
+                <w:left w:val="none" w:sz="0" w:space="0" w:color="000000"/>
+                <w:right w:val="none" w:sz="0" w:space="0" w:color="000000"/>
+              </w:pBdr>
+              <w:spacing w:after="40" w:before="40" w:line="240"/>
+              <w:ind w:left="40" w:right="40" w:firstLine="0" w:firstLineChars="0"/>
+              <w:rPr>
+                <w:rFonts w:ascii="Arial" w:hAnsi="Arial" w:eastAsia="Arial" w:cs="Arial"/>
+                <w:i w:val="false"/>
+                <w:b w:val="false"/>
+                <w:u w:val="none"/>
+                <w:strike w:val="false"/>
+                <w:sz w:val="8"/>
+                <w:szCs w:val="8"/>
+                <w:color w:val="000000"/>
+              </w:rPr>
+            </w:pPr>
+            <w:r>
+              <w:rPr>
+                <w:rFonts w:ascii="Arial" w:hAnsi="Arial" w:eastAsia="Arial" w:cs="Arial"/>
+                <w:i w:val="false"/>
+                <w:b w:val="false"/>
+                <w:u w:val="none"/>
+                <w:strike w:val="false"/>
+                <w:sz w:val="8"/>
+                <w:szCs w:val="8"/>
                 <w:color w:val="000000"/>
               </w:rPr>
               <w:t xml:space="preserve">-1,04</w:t>
+            </w:r>
+          </w:p>
+        </w:tc>
+      </w:tr>
+      <w:tr>
+        <w:trPr>
+          <w:trHeight w:val="176" w:hRule="auto"/>
+        </w:trPr>
+        <w:tc>
+          <w:tcPr>
+            <w:tcBorders>
+              <w:bottom w:val="none" w:sz="0" w:space="0" w:color="000000"/>
+              <w:top w:val="none" w:sz="0" w:space="0" w:color="000000"/>
+              <w:left w:val="none" w:sz="0" w:space="0" w:color="000000"/>
+              <w:right w:val="none" w:sz="0" w:space="0" w:color="000000"/>
+            </w:tcBorders>
+            <w:shd w:val="clear" w:color="auto" w:fill="FFFFFF"/>
+            <w:tcMar>
+              <w:top w:w="0" w:type="dxa"/>
+              <w:bottom w:w="0" w:type="dxa"/>
+              <w:left w:w="0" w:type="dxa"/>
+              <w:right w:w="0" w:type="dxa"/>
+            </w:tcMar>
+            <w:vAlign w:val="center"/>
+          </w:tcPr>
+          <w:p>
+            <w:pPr>
+              <w:pStyle w:val="Normal"/>
+              <w:jc w:val="center"/>
+              <w:pBdr>
+                <w:bottom w:val="none" w:sz="0" w:space="0" w:color="000000"/>
+                <w:top w:val="none" w:sz="0" w:space="0" w:color="000000"/>
+                <w:left w:val="none" w:sz="0" w:space="0" w:color="000000"/>
+                <w:right w:val="none" w:sz="0" w:space="0" w:color="000000"/>
+              </w:pBdr>
+              <w:spacing w:after="40" w:before="40" w:line="240"/>
+              <w:ind w:left="40" w:right="40" w:firstLine="0" w:firstLineChars="0"/>
+              <w:rPr>
+                <w:rFonts w:ascii="Arial" w:hAnsi="Arial" w:eastAsia="Arial" w:cs="Arial"/>
+                <w:i w:val="false"/>
+                <w:b w:val="false"/>
+                <w:u w:val="none"/>
+                <w:strike w:val="false"/>
+                <w:sz w:val="8"/>
+                <w:szCs w:val="8"/>
+                <w:color w:val="000000"/>
+              </w:rPr>
+            </w:pPr>
+            <w:r>
+              <w:rPr>
+                <w:rFonts w:ascii="Arial" w:hAnsi="Arial" w:eastAsia="Arial" w:cs="Arial"/>
+                <w:i w:val="false"/>
+                <w:b w:val="false"/>
+                <w:u w:val="none"/>
+                <w:strike w:val="false"/>
+                <w:sz w:val="8"/>
+                <w:szCs w:val="8"/>
+                <w:color w:val="000000"/>
+              </w:rPr>
+              <w:t xml:space="preserve">Promedio de la diferencia absoluta</w:t>
+            </w:r>
+          </w:p>
+        </w:tc>
+        <w:tc>
+          <w:tcPr>
+            <w:tcBorders>
+              <w:bottom w:val="none" w:sz="0" w:space="0" w:color="000000"/>
+              <w:top w:val="none" w:sz="0" w:space="0" w:color="000000"/>
+              <w:left w:val="none" w:sz="0" w:space="0" w:color="000000"/>
+              <w:right w:val="none" w:sz="0" w:space="0" w:color="000000"/>
+            </w:tcBorders>
+            <w:shd w:val="clear" w:color="auto" w:fill="FFFFFF"/>
+            <w:tcMar>
+              <w:top w:w="0" w:type="dxa"/>
+              <w:bottom w:w="0" w:type="dxa"/>
+              <w:left w:w="0" w:type="dxa"/>
+              <w:right w:w="0" w:type="dxa"/>
+            </w:tcMar>
+            <w:vAlign w:val="center"/>
+          </w:tcPr>
+          <w:p>
+            <w:pPr>
+              <w:pStyle w:val="Normal"/>
+              <w:jc w:val="center"/>
+              <w:pBdr>
+                <w:bottom w:val="none" w:sz="0" w:space="0" w:color="000000"/>
+                <w:top w:val="none" w:sz="0" w:space="0" w:color="000000"/>
+                <w:left w:val="none" w:sz="0" w:space="0" w:color="000000"/>
+                <w:right w:val="none" w:sz="0" w:space="0" w:color="000000"/>
+              </w:pBdr>
+              <w:spacing w:after="40" w:before="40" w:line="240"/>
+              <w:ind w:left="40" w:right="40" w:firstLine="0" w:firstLineChars="0"/>
+              <w:rPr>
+                <w:rFonts w:ascii="Arial" w:hAnsi="Arial" w:eastAsia="Arial" w:cs="Arial"/>
+                <w:i w:val="false"/>
+                <w:b w:val="false"/>
+                <w:u w:val="none"/>
+                <w:strike w:val="false"/>
+                <w:sz w:val="8"/>
+                <w:szCs w:val="8"/>
+                <w:color w:val="000000"/>
+              </w:rPr>
+            </w:pPr>
+            <w:r>
+              <w:rPr>
+                <w:rFonts w:ascii="Arial" w:hAnsi="Arial" w:eastAsia="Arial" w:cs="Arial"/>
+                <w:i w:val="false"/>
+                <w:b w:val="false"/>
+                <w:u w:val="none"/>
+                <w:strike w:val="false"/>
+                <w:sz w:val="8"/>
+                <w:szCs w:val="8"/>
+                <w:color w:val="000000"/>
+              </w:rPr>
+              <w:t xml:space="preserve"/>
+            </w:r>
+          </w:p>
+        </w:tc>
+        <w:tc>
+          <w:tcPr>
+            <w:tcBorders>
+              <w:bottom w:val="none" w:sz="0" w:space="0" w:color="000000"/>
+              <w:top w:val="none" w:sz="0" w:space="0" w:color="000000"/>
+              <w:left w:val="none" w:sz="0" w:space="0" w:color="000000"/>
+              <w:right w:val="none" w:sz="0" w:space="0" w:color="000000"/>
+            </w:tcBorders>
+            <w:shd w:val="clear" w:color="auto" w:fill="FFFFFF"/>
+            <w:tcMar>
+              <w:top w:w="0" w:type="dxa"/>
+              <w:bottom w:w="0" w:type="dxa"/>
+              <w:left w:w="0" w:type="dxa"/>
+              <w:right w:w="0" w:type="dxa"/>
+            </w:tcMar>
+            <w:vAlign w:val="center"/>
+          </w:tcPr>
+          <w:p>
+            <w:pPr>
+              <w:pStyle w:val="Normal"/>
+              <w:jc w:val="center"/>
+              <w:pBdr>
+                <w:bottom w:val="none" w:sz="0" w:space="0" w:color="000000"/>
+                <w:top w:val="none" w:sz="0" w:space="0" w:color="000000"/>
+                <w:left w:val="none" w:sz="0" w:space="0" w:color="000000"/>
+                <w:right w:val="none" w:sz="0" w:space="0" w:color="000000"/>
+              </w:pBdr>
+              <w:spacing w:after="40" w:before="40" w:line="240"/>
+              <w:ind w:left="40" w:right="40" w:firstLine="0" w:firstLineChars="0"/>
+              <w:rPr>
+                <w:rFonts w:ascii="Arial" w:hAnsi="Arial" w:eastAsia="Arial" w:cs="Arial"/>
+                <w:i w:val="false"/>
+                <w:b w:val="false"/>
+                <w:u w:val="none"/>
+                <w:strike w:val="false"/>
+                <w:sz w:val="8"/>
+                <w:szCs w:val="8"/>
+                <w:color w:val="000000"/>
+              </w:rPr>
+            </w:pPr>
+            <w:r>
+              <w:rPr>
+                <w:rFonts w:ascii="Arial" w:hAnsi="Arial" w:eastAsia="Arial" w:cs="Arial"/>
+                <w:i w:val="false"/>
+                <w:b w:val="false"/>
+                <w:u w:val="none"/>
+                <w:strike w:val="false"/>
+                <w:sz w:val="8"/>
+                <w:szCs w:val="8"/>
+                <w:color w:val="000000"/>
+              </w:rPr>
+              <w:t xml:space="preserve"/>
+            </w:r>
+          </w:p>
+        </w:tc>
+        <w:tc>
+          <w:tcPr>
+            <w:tcBorders>
+              <w:bottom w:val="none" w:sz="0" w:space="0" w:color="000000"/>
+              <w:top w:val="none" w:sz="0" w:space="0" w:color="000000"/>
+              <w:left w:val="none" w:sz="0" w:space="0" w:color="000000"/>
+              <w:right w:val="none" w:sz="0" w:space="0" w:color="000000"/>
+            </w:tcBorders>
+            <w:shd w:val="clear" w:color="auto" w:fill="FFFFFF"/>
+            <w:tcMar>
+              <w:top w:w="0" w:type="dxa"/>
+              <w:bottom w:w="0" w:type="dxa"/>
+              <w:left w:w="0" w:type="dxa"/>
+              <w:right w:w="0" w:type="dxa"/>
+            </w:tcMar>
+            <w:vAlign w:val="center"/>
+          </w:tcPr>
+          <w:p>
+            <w:pPr>
+              <w:pStyle w:val="Normal"/>
+              <w:jc w:val="center"/>
+              <w:pBdr>
+                <w:bottom w:val="none" w:sz="0" w:space="0" w:color="000000"/>
+                <w:top w:val="none" w:sz="0" w:space="0" w:color="000000"/>
+                <w:left w:val="none" w:sz="0" w:space="0" w:color="000000"/>
+                <w:right w:val="none" w:sz="0" w:space="0" w:color="000000"/>
+              </w:pBdr>
+              <w:spacing w:after="40" w:before="40" w:line="240"/>
+              <w:ind w:left="40" w:right="40" w:firstLine="0" w:firstLineChars="0"/>
+              <w:rPr>
+                <w:rFonts w:ascii="Arial" w:hAnsi="Arial" w:eastAsia="Arial" w:cs="Arial"/>
+                <w:i w:val="false"/>
+                <w:b w:val="false"/>
+                <w:u w:val="none"/>
+                <w:strike w:val="false"/>
+                <w:sz w:val="8"/>
+                <w:szCs w:val="8"/>
+                <w:color w:val="000000"/>
+              </w:rPr>
+            </w:pPr>
+            <w:r>
+              <w:rPr>
+                <w:rFonts w:ascii="Arial" w:hAnsi="Arial" w:eastAsia="Arial" w:cs="Arial"/>
+                <w:i w:val="false"/>
+                <w:b w:val="false"/>
+                <w:u w:val="none"/>
+                <w:strike w:val="false"/>
+                <w:sz w:val="8"/>
+                <w:szCs w:val="8"/>
+                <w:color w:val="000000"/>
+              </w:rPr>
+              <w:t xml:space="preserve"/>
+            </w:r>
+          </w:p>
+        </w:tc>
+        <w:tc>
+          <w:tcPr>
+            <w:tcBorders>
+              <w:bottom w:val="none" w:sz="0" w:space="0" w:color="000000"/>
+              <w:top w:val="none" w:sz="0" w:space="0" w:color="000000"/>
+              <w:left w:val="none" w:sz="0" w:space="0" w:color="000000"/>
+              <w:right w:val="none" w:sz="0" w:space="0" w:color="000000"/>
+            </w:tcBorders>
+            <w:shd w:val="clear" w:color="auto" w:fill="FFFFFF"/>
+            <w:tcMar>
+              <w:top w:w="0" w:type="dxa"/>
+              <w:bottom w:w="0" w:type="dxa"/>
+              <w:left w:w="0" w:type="dxa"/>
+              <w:right w:w="0" w:type="dxa"/>
+            </w:tcMar>
+            <w:vAlign w:val="center"/>
+          </w:tcPr>
+          <w:p>
+            <w:pPr>
+              <w:pStyle w:val="Normal"/>
+              <w:jc w:val="center"/>
+              <w:pBdr>
+                <w:bottom w:val="none" w:sz="0" w:space="0" w:color="000000"/>
+                <w:top w:val="none" w:sz="0" w:space="0" w:color="000000"/>
+                <w:left w:val="none" w:sz="0" w:space="0" w:color="000000"/>
+                <w:right w:val="none" w:sz="0" w:space="0" w:color="000000"/>
+              </w:pBdr>
+              <w:spacing w:after="40" w:before="40" w:line="240"/>
+              <w:ind w:left="40" w:right="40" w:firstLine="0" w:firstLineChars="0"/>
+              <w:rPr>
+                <w:rFonts w:ascii="Arial" w:hAnsi="Arial" w:eastAsia="Arial" w:cs="Arial"/>
+                <w:i w:val="false"/>
+                <w:b w:val="false"/>
+                <w:u w:val="none"/>
+                <w:strike w:val="false"/>
+                <w:sz w:val="8"/>
+                <w:szCs w:val="8"/>
+                <w:color w:val="000000"/>
+              </w:rPr>
+            </w:pPr>
+            <w:r>
+              <w:rPr>
+                <w:rFonts w:ascii="Arial" w:hAnsi="Arial" w:eastAsia="Arial" w:cs="Arial"/>
+                <w:i w:val="false"/>
+                <w:b w:val="false"/>
+                <w:u w:val="none"/>
+                <w:strike w:val="false"/>
+                <w:sz w:val="8"/>
+                <w:szCs w:val="8"/>
+                <w:color w:val="000000"/>
+              </w:rPr>
+              <w:t xml:space="preserve"/>
+            </w:r>
+          </w:p>
+        </w:tc>
+        <w:tc>
+          <w:tcPr>
+            <w:tcBorders>
+              <w:bottom w:val="none" w:sz="0" w:space="0" w:color="000000"/>
+              <w:top w:val="none" w:sz="0" w:space="0" w:color="000000"/>
+              <w:left w:val="none" w:sz="0" w:space="0" w:color="000000"/>
+              <w:right w:val="none" w:sz="0" w:space="0" w:color="000000"/>
+            </w:tcBorders>
+            <w:shd w:val="clear" w:color="auto" w:fill="FFFFFF"/>
+            <w:tcMar>
+              <w:top w:w="0" w:type="dxa"/>
+              <w:bottom w:w="0" w:type="dxa"/>
+              <w:left w:w="0" w:type="dxa"/>
+              <w:right w:w="0" w:type="dxa"/>
+            </w:tcMar>
+            <w:vAlign w:val="center"/>
+          </w:tcPr>
+          <w:p>
+            <w:pPr>
+              <w:pStyle w:val="Normal"/>
+              <w:jc w:val="center"/>
+              <w:pBdr>
+                <w:bottom w:val="none" w:sz="0" w:space="0" w:color="000000"/>
+                <w:top w:val="none" w:sz="0" w:space="0" w:color="000000"/>
+                <w:left w:val="none" w:sz="0" w:space="0" w:color="000000"/>
+                <w:right w:val="none" w:sz="0" w:space="0" w:color="000000"/>
+              </w:pBdr>
+              <w:spacing w:after="40" w:before="40" w:line="240"/>
+              <w:ind w:left="40" w:right="40" w:firstLine="0" w:firstLineChars="0"/>
+              <w:rPr>
+                <w:rFonts w:ascii="Arial" w:hAnsi="Arial" w:eastAsia="Arial" w:cs="Arial"/>
+                <w:i w:val="false"/>
+                <w:b w:val="false"/>
+                <w:u w:val="none"/>
+                <w:strike w:val="false"/>
+                <w:sz w:val="8"/>
+                <w:szCs w:val="8"/>
+                <w:color w:val="000000"/>
+              </w:rPr>
+            </w:pPr>
+            <w:r>
+              <w:rPr>
+                <w:rFonts w:ascii="Arial" w:hAnsi="Arial" w:eastAsia="Arial" w:cs="Arial"/>
+                <w:i w:val="false"/>
+                <w:b w:val="false"/>
+                <w:u w:val="none"/>
+                <w:strike w:val="false"/>
+                <w:sz w:val="8"/>
+                <w:szCs w:val="8"/>
+                <w:color w:val="000000"/>
+              </w:rPr>
+              <w:t xml:space="preserve"/>
+            </w:r>
+          </w:p>
+        </w:tc>
+        <w:tc>
+          <w:tcPr>
+            <w:tcBorders>
+              <w:bottom w:val="none" w:sz="0" w:space="0" w:color="000000"/>
+              <w:top w:val="none" w:sz="0" w:space="0" w:color="000000"/>
+              <w:left w:val="none" w:sz="0" w:space="0" w:color="000000"/>
+              <w:right w:val="none" w:sz="0" w:space="0" w:color="000000"/>
+            </w:tcBorders>
+            <w:shd w:val="clear" w:color="auto" w:fill="FFFFFF"/>
+            <w:tcMar>
+              <w:top w:w="0" w:type="dxa"/>
+              <w:bottom w:w="0" w:type="dxa"/>
+              <w:left w:w="0" w:type="dxa"/>
+              <w:right w:w="0" w:type="dxa"/>
+            </w:tcMar>
+            <w:vAlign w:val="center"/>
+          </w:tcPr>
+          <w:p>
+            <w:pPr>
+              <w:pStyle w:val="Normal"/>
+              <w:jc w:val="center"/>
+              <w:pBdr>
+                <w:bottom w:val="none" w:sz="0" w:space="0" w:color="000000"/>
+                <w:top w:val="none" w:sz="0" w:space="0" w:color="000000"/>
+                <w:left w:val="none" w:sz="0" w:space="0" w:color="000000"/>
+                <w:right w:val="none" w:sz="0" w:space="0" w:color="000000"/>
+              </w:pBdr>
+              <w:spacing w:after="40" w:before="40" w:line="240"/>
+              <w:ind w:left="40" w:right="40" w:firstLine="0" w:firstLineChars="0"/>
+              <w:rPr>
+                <w:rFonts w:ascii="Arial" w:hAnsi="Arial" w:eastAsia="Arial" w:cs="Arial"/>
+                <w:i w:val="false"/>
+                <w:b w:val="false"/>
+                <w:u w:val="none"/>
+                <w:strike w:val="false"/>
+                <w:sz w:val="8"/>
+                <w:szCs w:val="8"/>
+                <w:color w:val="000000"/>
+              </w:rPr>
+            </w:pPr>
+            <w:r>
+              <w:rPr>
+                <w:rFonts w:ascii="Arial" w:hAnsi="Arial" w:eastAsia="Arial" w:cs="Arial"/>
+                <w:i w:val="false"/>
+                <w:b w:val="false"/>
+                <w:u w:val="none"/>
+                <w:strike w:val="false"/>
+                <w:sz w:val="8"/>
+                <w:szCs w:val="8"/>
+                <w:color w:val="000000"/>
+              </w:rPr>
+              <w:t xml:space="preserve">0,92</w:t>
+            </w:r>
+          </w:p>
+        </w:tc>
+        <w:tc>
+          <w:tcPr>
+            <w:tcBorders>
+              <w:bottom w:val="none" w:sz="0" w:space="0" w:color="000000"/>
+              <w:top w:val="none" w:sz="0" w:space="0" w:color="000000"/>
+              <w:left w:val="none" w:sz="0" w:space="0" w:color="000000"/>
+              <w:right w:val="none" w:sz="0" w:space="0" w:color="000000"/>
+            </w:tcBorders>
+            <w:shd w:val="clear" w:color="auto" w:fill="FFFFFF"/>
+            <w:tcMar>
+              <w:top w:w="0" w:type="dxa"/>
+              <w:bottom w:w="0" w:type="dxa"/>
+              <w:left w:w="0" w:type="dxa"/>
+              <w:right w:w="0" w:type="dxa"/>
+            </w:tcMar>
+            <w:vAlign w:val="center"/>
+          </w:tcPr>
+          <w:p>
+            <w:pPr>
+              <w:pStyle w:val="Normal"/>
+              <w:jc w:val="center"/>
+              <w:pBdr>
+                <w:bottom w:val="none" w:sz="0" w:space="0" w:color="000000"/>
+                <w:top w:val="none" w:sz="0" w:space="0" w:color="000000"/>
+                <w:left w:val="none" w:sz="0" w:space="0" w:color="000000"/>
+                <w:right w:val="none" w:sz="0" w:space="0" w:color="000000"/>
+              </w:pBdr>
+              <w:spacing w:after="40" w:before="40" w:line="240"/>
+              <w:ind w:left="40" w:right="40" w:firstLine="0" w:firstLineChars="0"/>
+              <w:rPr>
+                <w:rFonts w:ascii="Arial" w:hAnsi="Arial" w:eastAsia="Arial" w:cs="Arial"/>
+                <w:i w:val="false"/>
+                <w:b w:val="false"/>
+                <w:u w:val="none"/>
+                <w:strike w:val="false"/>
+                <w:sz w:val="8"/>
+                <w:szCs w:val="8"/>
+                <w:color w:val="000000"/>
+              </w:rPr>
+            </w:pPr>
+            <w:r>
+              <w:rPr>
+                <w:rFonts w:ascii="Arial" w:hAnsi="Arial" w:eastAsia="Arial" w:cs="Arial"/>
+                <w:i w:val="false"/>
+                <w:b w:val="false"/>
+                <w:u w:val="none"/>
+                <w:strike w:val="false"/>
+                <w:sz w:val="8"/>
+                <w:szCs w:val="8"/>
+                <w:color w:val="000000"/>
+              </w:rPr>
+              <w:t xml:space="preserve">0,48</w:t>
             </w:r>
           </w:p>
         </w:tc>
@@ -6264,7 +7095,7 @@
           <w:szCs w:val="16"/>
           <w:color w:val="000000"/>
         </w:rPr>
-        <w:t xml:space="preserve">Estimaciones nacionales directas con diseño muestral complejo. 'Sin calibrar' usa el ponderador original del módulo de adultos; 'calibrado' lo ajusta por post-estratificación dentro de celdas de año, estrato de urbanidad, sexo y grupo quinquenal de edad, tomando como marco la población adulta elegible de cada ronda. Las tres últimas columnas comparan, solo para 2023 —la única ronda que lo distribuye—, el ponderador calibrado contra el ponderador propio del módulo de tensión arterial. pp: puntos porcentuales.</w:t>
+        <w:t xml:space="preserve">Estimaciones nacionales directas con diseño muestral complejo. 'Sin calibrar' usa el ponderador original del módulo de adultos; 'calibrado' lo ajusta por post-estratificación dentro de celdas de año, estrato de urbanidad, sexo y grupo quinquenal de edad, tomando como marco la población adulta elegible de cada ronda. Las cuatro últimas columnas comparan, solo para 2023 —la única ronda que lo distribuye—, el ponderador calibrado y el original contra el ponderador propio del módulo de tensión arterial; la diferencia es (estimación con nuestro ponderador − estimación con el ponderador de la encuesta). La fila final promedia el valor absoluto de esas diferencias en los 6 indicadores con dato de 2023: calibrar la reduce de 0,92 a 0,48 pp. pp: puntos porcentuales.</w:t>
       </w:r>
     </w:p>
     <w:p>

</xml_diff>

<commit_message>
Corregir el motivo de pobreza faltante, notacion KS y conectividad verificada del grafo (P3, P8)
Adopta la redaccion de Vicente para P3 (CONEVAL carece de pobreza en 3 municipios del marco,
no "creados despues de 2020"). S5 usa p<0,001 cuando el KS test redondea a 0. S7 reporta un BFS
independiente sobre municipios.graph (2478 nodos, 1 componente, 0 aristas asimetricas) en vez de
inferir conexidad de la ausencia de aislados. Responde el resto de P1-P8 en TEMPORAL/RESPUESTA_RODRIGO.md.

Co-Authored-By: Claude Sonnet 5 <noreply@anthropic.com>
</commit_message>
<xml_diff>
--- a/SUPLEMENTARIO/MATERIAL_SUPLEMENTARIO.docx
+++ b/SUPLEMENTARIO/MATERIAL_SUPLEMENTARIO.docx
@@ -23101,7 +23101,7 @@
                 <w:szCs w:val="14"/>
                 <w:color w:val="000000"/>
               </w:rPr>
-              <w:t xml:space="preserve">0,477 (KS p=0,000)</w:t>
+              <w:t xml:space="preserve">0,477 (KS p&lt;0,001)</w:t>
             </w:r>
           </w:p>
         </w:tc>
@@ -23436,7 +23436,7 @@
                 <w:szCs w:val="14"/>
                 <w:color w:val="000000"/>
               </w:rPr>
-              <w:t xml:space="preserve">0,466 (KS p=0,000)</w:t>
+              <w:t xml:space="preserve">0,466 (KS p&lt;0,001)</w:t>
             </w:r>
           </w:p>
         </w:tc>
@@ -23771,7 +23771,7 @@
                 <w:szCs w:val="14"/>
                 <w:color w:val="000000"/>
               </w:rPr>
-              <w:t xml:space="preserve">0,496 (KS p=0,000)</w:t>
+              <w:t xml:space="preserve">0,496 (KS p&lt;0,001)</w:t>
             </w:r>
           </w:p>
         </w:tc>
@@ -24106,7 +24106,7 @@
                 <w:szCs w:val="14"/>
                 <w:color w:val="000000"/>
               </w:rPr>
-              <w:t xml:space="preserve">0,477 (KS p=0,000)</w:t>
+              <w:t xml:space="preserve">0,477 (KS p&lt;0,001)</w:t>
             </w:r>
           </w:p>
         </w:tc>
@@ -24441,7 +24441,7 @@
                 <w:szCs w:val="14"/>
                 <w:color w:val="000000"/>
               </w:rPr>
-              <w:t xml:space="preserve">0,473 (KS p=0,000)</w:t>
+              <w:t xml:space="preserve">0,473 (KS p&lt;0,001)</w:t>
             </w:r>
           </w:p>
         </w:tc>
@@ -27093,7 +27093,7 @@
           <w:szCs w:val="20"/>
           <w:color w:val="000000"/>
         </w:rPr>
-        <w:t xml:space="preserve">El grafo se construyó con contigüidad tipo "reina" sobre la capa municipal 1:4 000 000 del INEGI. Ningún municipio quedó sin vecinos, de modo que el grafo tiene una sola componente conexa y el término ICAR del modelo BYM2 queda bien definido para los 2478 municipios. Los dos municipios insulares de Quintana Roo tampoco quedaron aislados: a la escala de generalización de esa capa, sus polígonos colindan con los municipios costeros contiguos, que son los mismos que se les asignaría por proximidad. El procedimiento de respaldo previsto en el código —conectar un municipio sin vecinos con aquel cuyo centroide esté más próximo— no llegó a aplicarse en ningún caso.</w:t>
+        <w:t xml:space="preserve">El grafo se construyó con contigüidad tipo "reina" sobre la capa municipal 1:4 000 000 del INEGI. Se verificó como una única componente conexa, con los 2478 municipios alcanzables entre sí y sin aristas asimétricas; ningún municipio quedó sin vecinos. El término ICAR del modelo BYM2 queda bien definido para los 2478 municipios. Los dos municipios insulares de Quintana Roo tampoco quedaron aislados: a la escala de generalización de esa capa, sus polígonos colindan con los municipios costeros contiguos, que son los mismos que se les asignaría por proximidad. El procedimiento de respaldo previsto en el código —conectar un municipio sin vecinos con aquel cuyo centroide esté más próximo— no llegó a aplicarse en ningún caso.</w:t>
       </w:r>
     </w:p>
     <w:p>

</xml_diff>